<commit_message>
docs: add actual source code excerpts with VS Code line references
</commit_message>
<xml_diff>
--- a/docs/Experiment_1_Agile_and_Scrum_Report.docx
+++ b/docs/Experiment_1_Agile_and_Scrum_Report.docx
@@ -5970,6 +5970,10 @@
           <w:rFonts w:ascii="Consolas" w:hAnsi="Consolas"/>
           <w:sz w:val="18"/>
         </w:rPr>
+        <w:t>48788db docs: deliver verified lab report Scrum records and CI evidence</w:t>
+        <w:br/>
+        <w:t>a41c981 ci: update official actions and package complete experiment files</w:t>
+        <w:br/>
         <w:t>90f694c Merge pull request #1 from Divyaprasad-Sahu/feat/prediction-confidence</w:t>
         <w:br/>
         <w:t>68d5dc6 feat: report leaf probability with Iris predictions</w:t>
@@ -5981,8 +5985,6 @@
         <w:t>456cb07 test: verify data accuracy prediction and saved model roundtrip</w:t>
         <w:br/>
         <w:t>862d998 feat: train validate and persist reproducible Iris classifier</w:t>
-        <w:br/>
-        <w:t>6967c0a chore: initialise organised Iris MLOps experiment</w:t>
       </w:r>
     </w:p>
     <w:p>
@@ -8689,6 +8691,2902 @@
           <w:t>GitHub Actions  https://docs.github.com/en/actions</w:t>
         </w:r>
       </w:hyperlink>
+    </w:p>
+    <w:p>
+      <w:r>
+        <w:br w:type="page"/>
+      </w:r>
+    </w:p>
+    <w:p>
+      <w:pPr>
+        <w:pStyle w:val="Heading1"/>
+      </w:pPr>
+      <w:r>
+        <w:t>Code excerpts for VS Code</w:t>
+      </w:r>
+    </w:p>
+    <w:p>
+      <w:r>
+        <w:t>The following excerpts are copied directly from the submitted project files. Filenames and actual line numbers make each section easy to locate in VS Code. The line numbers are display labels and are not part of the Python code.</w:t>
+      </w:r>
+    </w:p>
+    <w:p>
+      <w:pPr>
+        <w:pStyle w:val="Heading2"/>
+      </w:pPr>
+      <w:r>
+        <w:t>Dataset validation</w:t>
+      </w:r>
+    </w:p>
+    <w:p>
+      <w:r>
+        <w:t>src/iris_demo.py   |   Lines 21 to 31</w:t>
+      </w:r>
+    </w:p>
+    <w:p>
+      <w:pPr>
+        <w:spacing w:after="0" w:line="252" w:lineRule="auto"/>
+      </w:pPr>
+      <w:r>
+        <w:rPr>
+          <w:rFonts w:ascii="Consolas" w:hAnsi="Consolas"/>
+          <w:color w:val="666666"/>
+          <w:sz w:val="18"/>
+        </w:rPr>
+        <w:t xml:space="preserve"> 21  </w:t>
+      </w:r>
+      <w:r>
+        <w:rPr>
+          <w:rFonts w:ascii="Consolas" w:hAnsi="Consolas"/>
+          <w:color w:val="17365D"/>
+          <w:sz w:val="18"/>
+        </w:rPr>
+        <w:t>def validate_dataset(X, y):</w:t>
+      </w:r>
+    </w:p>
+    <w:p>
+      <w:pPr>
+        <w:spacing w:after="0" w:line="252" w:lineRule="auto"/>
+      </w:pPr>
+      <w:r>
+        <w:rPr>
+          <w:rFonts w:ascii="Consolas" w:hAnsi="Consolas"/>
+          <w:color w:val="666666"/>
+          <w:sz w:val="18"/>
+        </w:rPr>
+        <w:t xml:space="preserve"> 22  </w:t>
+      </w:r>
+      <w:r>
+        <w:rPr>
+          <w:rFonts w:ascii="Consolas" w:hAnsi="Consolas"/>
+          <w:sz w:val="18"/>
+        </w:rPr>
+        <w:t xml:space="preserve">    X, y = np.asarray(X), np.asarray(y)</w:t>
+      </w:r>
+    </w:p>
+    <w:p>
+      <w:pPr>
+        <w:spacing w:after="0" w:line="252" w:lineRule="auto"/>
+      </w:pPr>
+      <w:r>
+        <w:rPr>
+          <w:rFonts w:ascii="Consolas" w:hAnsi="Consolas"/>
+          <w:color w:val="666666"/>
+          <w:sz w:val="18"/>
+        </w:rPr>
+        <w:t xml:space="preserve"> 23  </w:t>
+      </w:r>
+      <w:r>
+        <w:rPr>
+          <w:rFonts w:ascii="Consolas" w:hAnsi="Consolas"/>
+          <w:color w:val="17365D"/>
+          <w:sz w:val="18"/>
+        </w:rPr>
+        <w:t xml:space="preserve">    if X.ndim != 2 or X.shape[1] != 4 or len(X) != len(y):</w:t>
+      </w:r>
+    </w:p>
+    <w:p>
+      <w:pPr>
+        <w:spacing w:after="0" w:line="252" w:lineRule="auto"/>
+      </w:pPr>
+      <w:r>
+        <w:rPr>
+          <w:rFonts w:ascii="Consolas" w:hAnsi="Consolas"/>
+          <w:color w:val="666666"/>
+          <w:sz w:val="18"/>
+        </w:rPr>
+        <w:t xml:space="preserve"> 24  </w:t>
+      </w:r>
+      <w:r>
+        <w:rPr>
+          <w:rFonts w:ascii="Consolas" w:hAnsi="Consolas"/>
+          <w:sz w:val="18"/>
+        </w:rPr>
+        <w:t xml:space="preserve">        raise ValueError("Expected four features per row and one target per row.")</w:t>
+      </w:r>
+    </w:p>
+    <w:p>
+      <w:pPr>
+        <w:spacing w:after="0" w:line="252" w:lineRule="auto"/>
+      </w:pPr>
+      <w:r>
+        <w:rPr>
+          <w:rFonts w:ascii="Consolas" w:hAnsi="Consolas"/>
+          <w:color w:val="666666"/>
+          <w:sz w:val="18"/>
+        </w:rPr>
+        <w:t xml:space="preserve"> 25  </w:t>
+      </w:r>
+      <w:r>
+        <w:rPr>
+          <w:rFonts w:ascii="Consolas" w:hAnsi="Consolas"/>
+          <w:color w:val="17365D"/>
+          <w:sz w:val="18"/>
+        </w:rPr>
+        <w:t xml:space="preserve">    if y.ndim != 1 or len(X) &lt; 5:</w:t>
+      </w:r>
+    </w:p>
+    <w:p>
+      <w:pPr>
+        <w:spacing w:after="0" w:line="252" w:lineRule="auto"/>
+      </w:pPr>
+      <w:r>
+        <w:rPr>
+          <w:rFonts w:ascii="Consolas" w:hAnsi="Consolas"/>
+          <w:color w:val="666666"/>
+          <w:sz w:val="18"/>
+        </w:rPr>
+        <w:t xml:space="preserve"> 26  </w:t>
+      </w:r>
+      <w:r>
+        <w:rPr>
+          <w:rFonts w:ascii="Consolas" w:hAnsi="Consolas"/>
+          <w:sz w:val="18"/>
+        </w:rPr>
+        <w:t xml:space="preserve">        raise ValueError("Expected a nonempty one-dimensional target array.")</w:t>
+      </w:r>
+    </w:p>
+    <w:p>
+      <w:pPr>
+        <w:spacing w:after="0" w:line="252" w:lineRule="auto"/>
+      </w:pPr>
+      <w:r>
+        <w:rPr>
+          <w:rFonts w:ascii="Consolas" w:hAnsi="Consolas"/>
+          <w:color w:val="666666"/>
+          <w:sz w:val="18"/>
+        </w:rPr>
+        <w:t xml:space="preserve"> 27  </w:t>
+      </w:r>
+      <w:r>
+        <w:rPr>
+          <w:rFonts w:ascii="Consolas" w:hAnsi="Consolas"/>
+          <w:color w:val="17365D"/>
+          <w:sz w:val="18"/>
+        </w:rPr>
+        <w:t xml:space="preserve">    if not np.isfinite(X).all() or (X &lt;= 0).any():</w:t>
+      </w:r>
+    </w:p>
+    <w:p>
+      <w:pPr>
+        <w:spacing w:after="0" w:line="252" w:lineRule="auto"/>
+      </w:pPr>
+      <w:r>
+        <w:rPr>
+          <w:rFonts w:ascii="Consolas" w:hAnsi="Consolas"/>
+          <w:color w:val="666666"/>
+          <w:sz w:val="18"/>
+        </w:rPr>
+        <w:t xml:space="preserve"> 28  </w:t>
+      </w:r>
+      <w:r>
+        <w:rPr>
+          <w:rFonts w:ascii="Consolas" w:hAnsi="Consolas"/>
+          <w:sz w:val="18"/>
+        </w:rPr>
+        <w:t xml:space="preserve">        raise ValueError("Measurements must be finite and positive.")</w:t>
+      </w:r>
+    </w:p>
+    <w:p>
+      <w:pPr>
+        <w:spacing w:after="0" w:line="252" w:lineRule="auto"/>
+      </w:pPr>
+      <w:r>
+        <w:rPr>
+          <w:rFonts w:ascii="Consolas" w:hAnsi="Consolas"/>
+          <w:color w:val="666666"/>
+          <w:sz w:val="18"/>
+        </w:rPr>
+        <w:t xml:space="preserve"> 29  </w:t>
+      </w:r>
+      <w:r>
+        <w:rPr>
+          <w:rFonts w:ascii="Consolas" w:hAnsi="Consolas"/>
+          <w:color w:val="17365D"/>
+          <w:sz w:val="18"/>
+        </w:rPr>
+        <w:t xml:space="preserve">    if not np.isin(y, [0, 1, 2]).all() or len(np.unique(y)) != 3:</w:t>
+      </w:r>
+    </w:p>
+    <w:p>
+      <w:pPr>
+        <w:spacing w:after="0" w:line="252" w:lineRule="auto"/>
+      </w:pPr>
+      <w:r>
+        <w:rPr>
+          <w:rFonts w:ascii="Consolas" w:hAnsi="Consolas"/>
+          <w:color w:val="666666"/>
+          <w:sz w:val="18"/>
+        </w:rPr>
+        <w:t xml:space="preserve"> 30  </w:t>
+      </w:r>
+      <w:r>
+        <w:rPr>
+          <w:rFonts w:ascii="Consolas" w:hAnsi="Consolas"/>
+          <w:sz w:val="18"/>
+        </w:rPr>
+        <w:t xml:space="preserve">        raise ValueError("Expected all three Iris target classes: 0, 1, 2.")</w:t>
+      </w:r>
+    </w:p>
+    <w:p>
+      <w:pPr>
+        <w:spacing w:after="0" w:line="252" w:lineRule="auto"/>
+      </w:pPr>
+      <w:r>
+        <w:rPr>
+          <w:rFonts w:ascii="Consolas" w:hAnsi="Consolas"/>
+          <w:color w:val="666666"/>
+          <w:sz w:val="18"/>
+        </w:rPr>
+        <w:t xml:space="preserve"> 31  </w:t>
+      </w:r>
+      <w:r>
+        <w:rPr>
+          <w:rFonts w:ascii="Consolas" w:hAnsi="Consolas"/>
+          <w:color w:val="17365D"/>
+          <w:sz w:val="18"/>
+        </w:rPr>
+        <w:t xml:space="preserve">    return X, y</w:t>
+      </w:r>
+    </w:p>
+    <w:p/>
+    <w:p>
+      <w:pPr>
+        <w:pStyle w:val="Heading2"/>
+      </w:pPr>
+      <w:r>
+        <w:t>Reproducible training and evaluation</w:t>
+      </w:r>
+    </w:p>
+    <w:p>
+      <w:r>
+        <w:t>src/iris_demo.py   |   Lines 34 to 63</w:t>
+      </w:r>
+    </w:p>
+    <w:p>
+      <w:pPr>
+        <w:spacing w:after="0" w:line="252" w:lineRule="auto"/>
+      </w:pPr>
+      <w:r>
+        <w:rPr>
+          <w:rFonts w:ascii="Consolas" w:hAnsi="Consolas"/>
+          <w:color w:val="666666"/>
+          <w:sz w:val="18"/>
+        </w:rPr>
+        <w:t xml:space="preserve"> 34  </w:t>
+      </w:r>
+      <w:r>
+        <w:rPr>
+          <w:rFonts w:ascii="Consolas" w:hAnsi="Consolas"/>
+          <w:color w:val="17365D"/>
+          <w:sz w:val="18"/>
+        </w:rPr>
+        <w:t>def train_model():</w:t>
+      </w:r>
+    </w:p>
+    <w:p>
+      <w:pPr>
+        <w:spacing w:after="0" w:line="252" w:lineRule="auto"/>
+      </w:pPr>
+      <w:r>
+        <w:rPr>
+          <w:rFonts w:ascii="Consolas" w:hAnsi="Consolas"/>
+          <w:color w:val="666666"/>
+          <w:sz w:val="18"/>
+        </w:rPr>
+        <w:t xml:space="preserve"> 35  </w:t>
+      </w:r>
+      <w:r>
+        <w:rPr>
+          <w:rFonts w:ascii="Consolas" w:hAnsi="Consolas"/>
+          <w:sz w:val="18"/>
+        </w:rPr>
+        <w:t xml:space="preserve">    iris = load_iris()</w:t>
+      </w:r>
+    </w:p>
+    <w:p>
+      <w:pPr>
+        <w:spacing w:after="0" w:line="252" w:lineRule="auto"/>
+      </w:pPr>
+      <w:r>
+        <w:rPr>
+          <w:rFonts w:ascii="Consolas" w:hAnsi="Consolas"/>
+          <w:color w:val="666666"/>
+          <w:sz w:val="18"/>
+        </w:rPr>
+        <w:t xml:space="preserve"> 36  </w:t>
+      </w:r>
+      <w:r>
+        <w:rPr>
+          <w:rFonts w:ascii="Consolas" w:hAnsi="Consolas"/>
+          <w:sz w:val="18"/>
+        </w:rPr>
+        <w:t xml:space="preserve">    X, y = validate_dataset(iris.data, iris.target)</w:t>
+      </w:r>
+    </w:p>
+    <w:p>
+      <w:pPr>
+        <w:spacing w:after="0" w:line="252" w:lineRule="auto"/>
+      </w:pPr>
+      <w:r>
+        <w:rPr>
+          <w:rFonts w:ascii="Consolas" w:hAnsi="Consolas"/>
+          <w:color w:val="666666"/>
+          <w:sz w:val="18"/>
+        </w:rPr>
+        <w:t xml:space="preserve"> 37  </w:t>
+      </w:r>
+      <w:r>
+        <w:rPr>
+          <w:rFonts w:ascii="Consolas" w:hAnsi="Consolas"/>
+          <w:color w:val="38761D"/>
+          <w:sz w:val="18"/>
+        </w:rPr>
+        <w:t xml:space="preserve">    # Match the supplied experiment's split; fix the classifier seed as well.</w:t>
+      </w:r>
+    </w:p>
+    <w:p>
+      <w:pPr>
+        <w:spacing w:after="0" w:line="252" w:lineRule="auto"/>
+      </w:pPr>
+      <w:r>
+        <w:rPr>
+          <w:rFonts w:ascii="Consolas" w:hAnsi="Consolas"/>
+          <w:color w:val="666666"/>
+          <w:sz w:val="18"/>
+        </w:rPr>
+        <w:t xml:space="preserve"> 38  </w:t>
+      </w:r>
+      <w:r>
+        <w:rPr>
+          <w:rFonts w:ascii="Consolas" w:hAnsi="Consolas"/>
+          <w:sz w:val="18"/>
+        </w:rPr>
+        <w:t xml:space="preserve">    X_train, X_test, y_train, y_test = train_test_split(</w:t>
+      </w:r>
+    </w:p>
+    <w:p>
+      <w:pPr>
+        <w:spacing w:after="0" w:line="252" w:lineRule="auto"/>
+      </w:pPr>
+      <w:r>
+        <w:rPr>
+          <w:rFonts w:ascii="Consolas" w:hAnsi="Consolas"/>
+          <w:color w:val="666666"/>
+          <w:sz w:val="18"/>
+        </w:rPr>
+        <w:t xml:space="preserve"> 39  </w:t>
+      </w:r>
+      <w:r>
+        <w:rPr>
+          <w:rFonts w:ascii="Consolas" w:hAnsi="Consolas"/>
+          <w:sz w:val="18"/>
+        </w:rPr>
+        <w:t xml:space="preserve">        X, y, test_size=0.2, random_state=SEED</w:t>
+      </w:r>
+    </w:p>
+    <w:p>
+      <w:pPr>
+        <w:spacing w:after="0" w:line="252" w:lineRule="auto"/>
+      </w:pPr>
+      <w:r>
+        <w:rPr>
+          <w:rFonts w:ascii="Consolas" w:hAnsi="Consolas"/>
+          <w:color w:val="666666"/>
+          <w:sz w:val="18"/>
+        </w:rPr>
+        <w:t xml:space="preserve"> 40  </w:t>
+      </w:r>
+      <w:r>
+        <w:rPr>
+          <w:rFonts w:ascii="Consolas" w:hAnsi="Consolas"/>
+          <w:sz w:val="18"/>
+        </w:rPr>
+        <w:t xml:space="preserve">    )</w:t>
+      </w:r>
+    </w:p>
+    <w:p>
+      <w:pPr>
+        <w:spacing w:after="0" w:line="252" w:lineRule="auto"/>
+      </w:pPr>
+      <w:r>
+        <w:rPr>
+          <w:rFonts w:ascii="Consolas" w:hAnsi="Consolas"/>
+          <w:color w:val="666666"/>
+          <w:sz w:val="18"/>
+        </w:rPr>
+        <w:t xml:space="preserve"> 41  </w:t>
+      </w:r>
+      <w:r>
+        <w:rPr>
+          <w:rFonts w:ascii="Consolas" w:hAnsi="Consolas"/>
+          <w:sz w:val="18"/>
+        </w:rPr>
+        <w:t xml:space="preserve">    model = DecisionTreeClassifier(random_state=SEED)</w:t>
+      </w:r>
+    </w:p>
+    <w:p>
+      <w:pPr>
+        <w:spacing w:after="0" w:line="252" w:lineRule="auto"/>
+      </w:pPr>
+      <w:r>
+        <w:rPr>
+          <w:rFonts w:ascii="Consolas" w:hAnsi="Consolas"/>
+          <w:color w:val="666666"/>
+          <w:sz w:val="18"/>
+        </w:rPr>
+        <w:t xml:space="preserve"> 42  </w:t>
+      </w:r>
+      <w:r>
+        <w:rPr>
+          <w:rFonts w:ascii="Consolas" w:hAnsi="Consolas"/>
+          <w:sz w:val="18"/>
+        </w:rPr>
+        <w:t xml:space="preserve">    model.fit(X_train, y_train)</w:t>
+      </w:r>
+    </w:p>
+    <w:p>
+      <w:pPr>
+        <w:spacing w:after="0" w:line="252" w:lineRule="auto"/>
+      </w:pPr>
+      <w:r>
+        <w:rPr>
+          <w:rFonts w:ascii="Consolas" w:hAnsi="Consolas"/>
+          <w:color w:val="666666"/>
+          <w:sz w:val="18"/>
+        </w:rPr>
+        <w:t xml:space="preserve"> 43  </w:t>
+      </w:r>
+      <w:r>
+        <w:rPr>
+          <w:rFonts w:ascii="Consolas" w:hAnsi="Consolas"/>
+          <w:sz w:val="18"/>
+        </w:rPr>
+        <w:t xml:space="preserve">    predictions = model.predict(X_test)</w:t>
+      </w:r>
+    </w:p>
+    <w:p>
+      <w:pPr>
+        <w:spacing w:after="0" w:line="252" w:lineRule="auto"/>
+      </w:pPr>
+      <w:r>
+        <w:rPr>
+          <w:rFonts w:ascii="Consolas" w:hAnsi="Consolas"/>
+          <w:color w:val="666666"/>
+          <w:sz w:val="18"/>
+        </w:rPr>
+        <w:t xml:space="preserve"> 44  </w:t>
+      </w:r>
+      <w:r>
+        <w:rPr>
+          <w:rFonts w:ascii="Consolas" w:hAnsi="Consolas"/>
+          <w:sz w:val="18"/>
+        </w:rPr>
+        <w:t xml:space="preserve">    metrics = {</w:t>
+      </w:r>
+    </w:p>
+    <w:p>
+      <w:pPr>
+        <w:spacing w:after="0" w:line="252" w:lineRule="auto"/>
+      </w:pPr>
+      <w:r>
+        <w:rPr>
+          <w:rFonts w:ascii="Consolas" w:hAnsi="Consolas"/>
+          <w:color w:val="666666"/>
+          <w:sz w:val="18"/>
+        </w:rPr>
+        <w:t xml:space="preserve"> 45  </w:t>
+      </w:r>
+      <w:r>
+        <w:rPr>
+          <w:rFonts w:ascii="Consolas" w:hAnsi="Consolas"/>
+          <w:sz w:val="18"/>
+        </w:rPr>
+        <w:t xml:space="preserve">        "accuracy": float(accuracy_score(y_test, predictions)),</w:t>
+      </w:r>
+    </w:p>
+    <w:p>
+      <w:pPr>
+        <w:spacing w:after="0" w:line="252" w:lineRule="auto"/>
+      </w:pPr>
+      <w:r>
+        <w:rPr>
+          <w:rFonts w:ascii="Consolas" w:hAnsi="Consolas"/>
+          <w:color w:val="666666"/>
+          <w:sz w:val="18"/>
+        </w:rPr>
+        <w:t xml:space="preserve"> 46  </w:t>
+      </w:r>
+      <w:r>
+        <w:rPr>
+          <w:rFonts w:ascii="Consolas" w:hAnsi="Consolas"/>
+          <w:sz w:val="18"/>
+        </w:rPr>
+        <w:t xml:space="preserve">        "minimum_accuracy": MIN_ACCURACY,</w:t>
+      </w:r>
+    </w:p>
+    <w:p>
+      <w:pPr>
+        <w:spacing w:after="0" w:line="252" w:lineRule="auto"/>
+      </w:pPr>
+      <w:r>
+        <w:rPr>
+          <w:rFonts w:ascii="Consolas" w:hAnsi="Consolas"/>
+          <w:color w:val="666666"/>
+          <w:sz w:val="18"/>
+        </w:rPr>
+        <w:t xml:space="preserve"> 47  </w:t>
+      </w:r>
+      <w:r>
+        <w:rPr>
+          <w:rFonts w:ascii="Consolas" w:hAnsi="Consolas"/>
+          <w:sz w:val="18"/>
+        </w:rPr>
+        <w:t xml:space="preserve">        "random_state": SEED,</w:t>
+      </w:r>
+    </w:p>
+    <w:p>
+      <w:pPr>
+        <w:spacing w:after="0" w:line="252" w:lineRule="auto"/>
+      </w:pPr>
+      <w:r>
+        <w:rPr>
+          <w:rFonts w:ascii="Consolas" w:hAnsi="Consolas"/>
+          <w:color w:val="666666"/>
+          <w:sz w:val="18"/>
+        </w:rPr>
+        <w:t xml:space="preserve"> 48  </w:t>
+      </w:r>
+      <w:r>
+        <w:rPr>
+          <w:rFonts w:ascii="Consolas" w:hAnsi="Consolas"/>
+          <w:sz w:val="18"/>
+        </w:rPr>
+        <w:t xml:space="preserve">        "train_rows": len(X_train),</w:t>
+      </w:r>
+    </w:p>
+    <w:p>
+      <w:pPr>
+        <w:spacing w:after="0" w:line="252" w:lineRule="auto"/>
+      </w:pPr>
+      <w:r>
+        <w:rPr>
+          <w:rFonts w:ascii="Consolas" w:hAnsi="Consolas"/>
+          <w:color w:val="666666"/>
+          <w:sz w:val="18"/>
+        </w:rPr>
+        <w:t xml:space="preserve"> 49  </w:t>
+      </w:r>
+      <w:r>
+        <w:rPr>
+          <w:rFonts w:ascii="Consolas" w:hAnsi="Consolas"/>
+          <w:sz w:val="18"/>
+        </w:rPr>
+        <w:t xml:space="preserve">        "test_rows": len(X_test),</w:t>
+      </w:r>
+    </w:p>
+    <w:p>
+      <w:pPr>
+        <w:spacing w:after="0" w:line="252" w:lineRule="auto"/>
+      </w:pPr>
+      <w:r>
+        <w:rPr>
+          <w:rFonts w:ascii="Consolas" w:hAnsi="Consolas"/>
+          <w:color w:val="666666"/>
+          <w:sz w:val="18"/>
+        </w:rPr>
+        <w:t xml:space="preserve"> 50  </w:t>
+      </w:r>
+      <w:r>
+        <w:rPr>
+          <w:rFonts w:ascii="Consolas" w:hAnsi="Consolas"/>
+          <w:sz w:val="18"/>
+        </w:rPr>
+        <w:t xml:space="preserve">        "feature_names": list(iris.feature_names),</w:t>
+      </w:r>
+    </w:p>
+    <w:p>
+      <w:pPr>
+        <w:spacing w:after="0" w:line="252" w:lineRule="auto"/>
+      </w:pPr>
+      <w:r>
+        <w:rPr>
+          <w:rFonts w:ascii="Consolas" w:hAnsi="Consolas"/>
+          <w:color w:val="666666"/>
+          <w:sz w:val="18"/>
+        </w:rPr>
+        <w:t xml:space="preserve"> 51  </w:t>
+      </w:r>
+      <w:r>
+        <w:rPr>
+          <w:rFonts w:ascii="Consolas" w:hAnsi="Consolas"/>
+          <w:sz w:val="18"/>
+        </w:rPr>
+        <w:t xml:space="preserve">        "target_names": list(iris.target_names),</w:t>
+      </w:r>
+    </w:p>
+    <w:p>
+      <w:pPr>
+        <w:spacing w:after="0" w:line="252" w:lineRule="auto"/>
+      </w:pPr>
+      <w:r>
+        <w:rPr>
+          <w:rFonts w:ascii="Consolas" w:hAnsi="Consolas"/>
+          <w:color w:val="666666"/>
+          <w:sz w:val="18"/>
+        </w:rPr>
+        <w:t xml:space="preserve"> 52  </w:t>
+      </w:r>
+      <w:r>
+        <w:rPr>
+          <w:rFonts w:ascii="Consolas" w:hAnsi="Consolas"/>
+          <w:sz w:val="18"/>
+        </w:rPr>
+        <w:t xml:space="preserve">        "confusion_matrix": confusion_matrix(y_test, predictions, labels=[0, 1, 2]).tolist(),</w:t>
+      </w:r>
+    </w:p>
+    <w:p>
+      <w:pPr>
+        <w:spacing w:after="0" w:line="252" w:lineRule="auto"/>
+      </w:pPr>
+      <w:r>
+        <w:rPr>
+          <w:rFonts w:ascii="Consolas" w:hAnsi="Consolas"/>
+          <w:color w:val="666666"/>
+          <w:sz w:val="18"/>
+        </w:rPr>
+        <w:t xml:space="preserve"> 53  </w:t>
+      </w:r>
+      <w:r>
+        <w:rPr>
+          <w:rFonts w:ascii="Consolas" w:hAnsi="Consolas"/>
+          <w:sz w:val="18"/>
+        </w:rPr>
+        <w:t xml:space="preserve">        "classification_report": classification_report(</w:t>
+      </w:r>
+    </w:p>
+    <w:p>
+      <w:pPr>
+        <w:spacing w:after="0" w:line="252" w:lineRule="auto"/>
+      </w:pPr>
+      <w:r>
+        <w:rPr>
+          <w:rFonts w:ascii="Consolas" w:hAnsi="Consolas"/>
+          <w:color w:val="666666"/>
+          <w:sz w:val="18"/>
+        </w:rPr>
+        <w:t xml:space="preserve"> 54  </w:t>
+      </w:r>
+      <w:r>
+        <w:rPr>
+          <w:rFonts w:ascii="Consolas" w:hAnsi="Consolas"/>
+          <w:sz w:val="18"/>
+        </w:rPr>
+        <w:t xml:space="preserve">            y_test, predictions, labels=[0, 1, 2],</w:t>
+      </w:r>
+    </w:p>
+    <w:p>
+      <w:pPr>
+        <w:spacing w:after="0" w:line="252" w:lineRule="auto"/>
+      </w:pPr>
+      <w:r>
+        <w:rPr>
+          <w:rFonts w:ascii="Consolas" w:hAnsi="Consolas"/>
+          <w:color w:val="666666"/>
+          <w:sz w:val="18"/>
+        </w:rPr>
+        <w:t xml:space="preserve"> 55  </w:t>
+      </w:r>
+      <w:r>
+        <w:rPr>
+          <w:rFonts w:ascii="Consolas" w:hAnsi="Consolas"/>
+          <w:sz w:val="18"/>
+        </w:rPr>
+        <w:t xml:space="preserve">            target_names=iris.target_names, output_dict=True, zero_division=0</w:t>
+      </w:r>
+    </w:p>
+    <w:p>
+      <w:pPr>
+        <w:spacing w:after="0" w:line="252" w:lineRule="auto"/>
+      </w:pPr>
+      <w:r>
+        <w:rPr>
+          <w:rFonts w:ascii="Consolas" w:hAnsi="Consolas"/>
+          <w:color w:val="666666"/>
+          <w:sz w:val="18"/>
+        </w:rPr>
+        <w:t xml:space="preserve"> 56  </w:t>
+      </w:r>
+      <w:r>
+        <w:rPr>
+          <w:rFonts w:ascii="Consolas" w:hAnsi="Consolas"/>
+          <w:sz w:val="18"/>
+        </w:rPr>
+        <w:t xml:space="preserve">        ),</w:t>
+      </w:r>
+    </w:p>
+    <w:p>
+      <w:pPr>
+        <w:spacing w:after="0" w:line="252" w:lineRule="auto"/>
+      </w:pPr>
+      <w:r>
+        <w:rPr>
+          <w:rFonts w:ascii="Consolas" w:hAnsi="Consolas"/>
+          <w:color w:val="666666"/>
+          <w:sz w:val="18"/>
+        </w:rPr>
+        <w:t xml:space="preserve"> 57  </w:t>
+      </w:r>
+      <w:r>
+        <w:rPr>
+          <w:rFonts w:ascii="Consolas" w:hAnsi="Consolas"/>
+          <w:sz w:val="18"/>
+        </w:rPr>
+        <w:t xml:space="preserve">        "missing_values": int(np.isnan(X).sum()),</w:t>
+      </w:r>
+    </w:p>
+    <w:p>
+      <w:pPr>
+        <w:spacing w:after="0" w:line="252" w:lineRule="auto"/>
+      </w:pPr>
+      <w:r>
+        <w:rPr>
+          <w:rFonts w:ascii="Consolas" w:hAnsi="Consolas"/>
+          <w:color w:val="666666"/>
+          <w:sz w:val="18"/>
+        </w:rPr>
+        <w:t xml:space="preserve"> 58  </w:t>
+      </w:r>
+      <w:r>
+        <w:rPr>
+          <w:rFonts w:ascii="Consolas" w:hAnsi="Consolas"/>
+          <w:sz w:val="18"/>
+        </w:rPr>
+        <w:t xml:space="preserve">        "duplicate_rows": int(len(X) - len(np.unique(np.column_stack([X, y]), axis=0))),</w:t>
+      </w:r>
+    </w:p>
+    <w:p>
+      <w:pPr>
+        <w:spacing w:after="0" w:line="252" w:lineRule="auto"/>
+      </w:pPr>
+      <w:r>
+        <w:rPr>
+          <w:rFonts w:ascii="Consolas" w:hAnsi="Consolas"/>
+          <w:color w:val="666666"/>
+          <w:sz w:val="18"/>
+        </w:rPr>
+        <w:t xml:space="preserve"> 59  </w:t>
+      </w:r>
+      <w:r>
+        <w:rPr>
+          <w:rFonts w:ascii="Consolas" w:hAnsi="Consolas"/>
+          <w:sz w:val="18"/>
+        </w:rPr>
+        <w:t xml:space="preserve">    }</w:t>
+      </w:r>
+    </w:p>
+    <w:p>
+      <w:pPr>
+        <w:spacing w:after="0" w:line="252" w:lineRule="auto"/>
+      </w:pPr>
+      <w:r>
+        <w:rPr>
+          <w:rFonts w:ascii="Consolas" w:hAnsi="Consolas"/>
+          <w:color w:val="666666"/>
+          <w:sz w:val="18"/>
+        </w:rPr>
+        <w:t xml:space="preserve"> 60  </w:t>
+      </w:r>
+      <w:r>
+        <w:rPr>
+          <w:rFonts w:ascii="Consolas" w:hAnsi="Consolas"/>
+          <w:color w:val="38761D"/>
+          <w:sz w:val="18"/>
+        </w:rPr>
+        <w:t xml:space="preserve">    # Retain duplicates to reproduce the supplied dataset and split.</w:t>
+      </w:r>
+    </w:p>
+    <w:p>
+      <w:pPr>
+        <w:spacing w:after="0" w:line="252" w:lineRule="auto"/>
+      </w:pPr>
+      <w:r>
+        <w:rPr>
+          <w:rFonts w:ascii="Consolas" w:hAnsi="Consolas"/>
+          <w:color w:val="666666"/>
+          <w:sz w:val="18"/>
+        </w:rPr>
+        <w:t xml:space="preserve"> 61  </w:t>
+      </w:r>
+      <w:r>
+        <w:rPr>
+          <w:rFonts w:ascii="Consolas" w:hAnsi="Consolas"/>
+          <w:sz w:val="18"/>
+        </w:rPr>
+        <w:t xml:space="preserve">    bundle = {"model": model, "target_names": list(iris.target_names),</w:t>
+      </w:r>
+    </w:p>
+    <w:p>
+      <w:pPr>
+        <w:spacing w:after="0" w:line="252" w:lineRule="auto"/>
+      </w:pPr>
+      <w:r>
+        <w:rPr>
+          <w:rFonts w:ascii="Consolas" w:hAnsi="Consolas"/>
+          <w:color w:val="666666"/>
+          <w:sz w:val="18"/>
+        </w:rPr>
+        <w:t xml:space="preserve"> 62  </w:t>
+      </w:r>
+      <w:r>
+        <w:rPr>
+          <w:rFonts w:ascii="Consolas" w:hAnsi="Consolas"/>
+          <w:sz w:val="18"/>
+        </w:rPr>
+        <w:t xml:space="preserve">              "feature_names": list(iris.feature_names)}</w:t>
+      </w:r>
+    </w:p>
+    <w:p>
+      <w:pPr>
+        <w:spacing w:after="0" w:line="252" w:lineRule="auto"/>
+      </w:pPr>
+      <w:r>
+        <w:rPr>
+          <w:rFonts w:ascii="Consolas" w:hAnsi="Consolas"/>
+          <w:color w:val="666666"/>
+          <w:sz w:val="18"/>
+        </w:rPr>
+        <w:t xml:space="preserve"> 63  </w:t>
+      </w:r>
+      <w:r>
+        <w:rPr>
+          <w:rFonts w:ascii="Consolas" w:hAnsi="Consolas"/>
+          <w:color w:val="17365D"/>
+          <w:sz w:val="18"/>
+        </w:rPr>
+        <w:t xml:space="preserve">    return bundle, metrics</w:t>
+      </w:r>
+    </w:p>
+    <w:p/>
+    <w:p>
+      <w:r>
+        <w:t>The split and classifier use seed 42. Evaluation uses only held-out examples, and the resulting metrics include accuracy, class labels, a confusion matrix and a dataset audit.</w:t>
+      </w:r>
+    </w:p>
+    <w:p>
+      <w:r>
+        <w:br w:type="page"/>
+      </w:r>
+    </w:p>
+    <w:p>
+      <w:pPr>
+        <w:pStyle w:val="Heading1"/>
+      </w:pPr>
+      <w:r>
+        <w:t>Prediction and saved model code</w:t>
+      </w:r>
+    </w:p>
+    <w:p>
+      <w:pPr>
+        <w:pStyle w:val="Heading2"/>
+      </w:pPr>
+      <w:r>
+        <w:t>Validated prediction with leaf probability</w:t>
+      </w:r>
+    </w:p>
+    <w:p>
+      <w:r>
+        <w:t>src/iris_demo.py   |   Lines 66 to 76</w:t>
+      </w:r>
+    </w:p>
+    <w:p>
+      <w:pPr>
+        <w:spacing w:after="0" w:line="252" w:lineRule="auto"/>
+      </w:pPr>
+      <w:r>
+        <w:rPr>
+          <w:rFonts w:ascii="Consolas" w:hAnsi="Consolas"/>
+          <w:color w:val="666666"/>
+          <w:sz w:val="18"/>
+        </w:rPr>
+        <w:t xml:space="preserve"> 66  </w:t>
+      </w:r>
+      <w:r>
+        <w:rPr>
+          <w:rFonts w:ascii="Consolas" w:hAnsi="Consolas"/>
+          <w:color w:val="17365D"/>
+          <w:sz w:val="18"/>
+        </w:rPr>
+        <w:t>def prediction_details(bundle, measurements):</w:t>
+      </w:r>
+    </w:p>
+    <w:p>
+      <w:pPr>
+        <w:spacing w:after="0" w:line="252" w:lineRule="auto"/>
+      </w:pPr>
+      <w:r>
+        <w:rPr>
+          <w:rFonts w:ascii="Consolas" w:hAnsi="Consolas"/>
+          <w:color w:val="666666"/>
+          <w:sz w:val="18"/>
+        </w:rPr>
+        <w:t xml:space="preserve"> 67  </w:t>
+      </w:r>
+      <w:r>
+        <w:rPr>
+          <w:rFonts w:ascii="Consolas" w:hAnsi="Consolas"/>
+          <w:sz w:val="18"/>
+        </w:rPr>
+        <w:t xml:space="preserve">    values = np.asarray(measurements, dtype=float)</w:t>
+      </w:r>
+    </w:p>
+    <w:p>
+      <w:pPr>
+        <w:spacing w:after="0" w:line="252" w:lineRule="auto"/>
+      </w:pPr>
+      <w:r>
+        <w:rPr>
+          <w:rFonts w:ascii="Consolas" w:hAnsi="Consolas"/>
+          <w:color w:val="666666"/>
+          <w:sz w:val="18"/>
+        </w:rPr>
+        <w:t xml:space="preserve"> 68  </w:t>
+      </w:r>
+      <w:r>
+        <w:rPr>
+          <w:rFonts w:ascii="Consolas" w:hAnsi="Consolas"/>
+          <w:color w:val="17365D"/>
+          <w:sz w:val="18"/>
+        </w:rPr>
+        <w:t xml:space="preserve">    if values.shape != (4,) or not np.isfinite(values).all() or (values &lt;= 0).any():</w:t>
+      </w:r>
+    </w:p>
+    <w:p>
+      <w:pPr>
+        <w:spacing w:after="0" w:line="252" w:lineRule="auto"/>
+      </w:pPr>
+      <w:r>
+        <w:rPr>
+          <w:rFonts w:ascii="Consolas" w:hAnsi="Consolas"/>
+          <w:color w:val="666666"/>
+          <w:sz w:val="18"/>
+        </w:rPr>
+        <w:t xml:space="preserve"> 69  </w:t>
+      </w:r>
+      <w:r>
+        <w:rPr>
+          <w:rFonts w:ascii="Consolas" w:hAnsi="Consolas"/>
+          <w:sz w:val="18"/>
+        </w:rPr>
+        <w:t xml:space="preserve">        raise ValueError("Supply exactly four finite, positive measurements in centimetres.")</w:t>
+      </w:r>
+    </w:p>
+    <w:p>
+      <w:pPr>
+        <w:spacing w:after="0" w:line="252" w:lineRule="auto"/>
+      </w:pPr>
+      <w:r>
+        <w:rPr>
+          <w:rFonts w:ascii="Consolas" w:hAnsi="Consolas"/>
+          <w:color w:val="666666"/>
+          <w:sz w:val="18"/>
+        </w:rPr>
+        <w:t xml:space="preserve"> 70  </w:t>
+      </w:r>
+      <w:r>
+        <w:rPr>
+          <w:rFonts w:ascii="Consolas" w:hAnsi="Consolas"/>
+          <w:sz w:val="18"/>
+        </w:rPr>
+        <w:t xml:space="preserve">    model = bundle["model"]</w:t>
+      </w:r>
+    </w:p>
+    <w:p>
+      <w:pPr>
+        <w:spacing w:after="0" w:line="252" w:lineRule="auto"/>
+      </w:pPr>
+      <w:r>
+        <w:rPr>
+          <w:rFonts w:ascii="Consolas" w:hAnsi="Consolas"/>
+          <w:color w:val="666666"/>
+          <w:sz w:val="18"/>
+        </w:rPr>
+        <w:t xml:space="preserve"> 71  </w:t>
+      </w:r>
+      <w:r>
+        <w:rPr>
+          <w:rFonts w:ascii="Consolas" w:hAnsi="Consolas"/>
+          <w:sz w:val="18"/>
+        </w:rPr>
+        <w:t xml:space="preserve">    row = values.reshape(1, 4)</w:t>
+      </w:r>
+    </w:p>
+    <w:p>
+      <w:pPr>
+        <w:spacing w:after="0" w:line="252" w:lineRule="auto"/>
+      </w:pPr>
+      <w:r>
+        <w:rPr>
+          <w:rFonts w:ascii="Consolas" w:hAnsi="Consolas"/>
+          <w:color w:val="666666"/>
+          <w:sz w:val="18"/>
+        </w:rPr>
+        <w:t xml:space="preserve"> 72  </w:t>
+      </w:r>
+      <w:r>
+        <w:rPr>
+          <w:rFonts w:ascii="Consolas" w:hAnsi="Consolas"/>
+          <w:sz w:val="18"/>
+        </w:rPr>
+        <w:t xml:space="preserve">    probabilities = model.predict_proba(row)[0]</w:t>
+      </w:r>
+    </w:p>
+    <w:p>
+      <w:pPr>
+        <w:spacing w:after="0" w:line="252" w:lineRule="auto"/>
+      </w:pPr>
+      <w:r>
+        <w:rPr>
+          <w:rFonts w:ascii="Consolas" w:hAnsi="Consolas"/>
+          <w:color w:val="666666"/>
+          <w:sz w:val="18"/>
+        </w:rPr>
+        <w:t xml:space="preserve"> 73  </w:t>
+      </w:r>
+      <w:r>
+        <w:rPr>
+          <w:rFonts w:ascii="Consolas" w:hAnsi="Consolas"/>
+          <w:sz w:val="18"/>
+        </w:rPr>
+        <w:t xml:space="preserve">    position = int(np.argmax(probabilities))</w:t>
+      </w:r>
+    </w:p>
+    <w:p>
+      <w:pPr>
+        <w:spacing w:after="0" w:line="252" w:lineRule="auto"/>
+      </w:pPr>
+      <w:r>
+        <w:rPr>
+          <w:rFonts w:ascii="Consolas" w:hAnsi="Consolas"/>
+          <w:color w:val="666666"/>
+          <w:sz w:val="18"/>
+        </w:rPr>
+        <w:t xml:space="preserve"> 74  </w:t>
+      </w:r>
+      <w:r>
+        <w:rPr>
+          <w:rFonts w:ascii="Consolas" w:hAnsi="Consolas"/>
+          <w:sz w:val="18"/>
+        </w:rPr>
+        <w:t xml:space="preserve">    class_id = int(model.classes_[position])</w:t>
+      </w:r>
+    </w:p>
+    <w:p>
+      <w:pPr>
+        <w:spacing w:after="0" w:line="252" w:lineRule="auto"/>
+      </w:pPr>
+      <w:r>
+        <w:rPr>
+          <w:rFonts w:ascii="Consolas" w:hAnsi="Consolas"/>
+          <w:color w:val="666666"/>
+          <w:sz w:val="18"/>
+        </w:rPr>
+        <w:t xml:space="preserve"> 75  </w:t>
+      </w:r>
+      <w:r>
+        <w:rPr>
+          <w:rFonts w:ascii="Consolas" w:hAnsi="Consolas"/>
+          <w:color w:val="17365D"/>
+          <w:sz w:val="18"/>
+        </w:rPr>
+        <w:t xml:space="preserve">    return {"species": bundle["target_names"][class_id],</w:t>
+      </w:r>
+    </w:p>
+    <w:p>
+      <w:pPr>
+        <w:spacing w:after="0" w:line="252" w:lineRule="auto"/>
+      </w:pPr>
+      <w:r>
+        <w:rPr>
+          <w:rFonts w:ascii="Consolas" w:hAnsi="Consolas"/>
+          <w:color w:val="666666"/>
+          <w:sz w:val="18"/>
+        </w:rPr>
+        <w:t xml:space="preserve"> 76  </w:t>
+      </w:r>
+      <w:r>
+        <w:rPr>
+          <w:rFonts w:ascii="Consolas" w:hAnsi="Consolas"/>
+          <w:sz w:val="18"/>
+        </w:rPr>
+        <w:t xml:space="preserve">            "leaf_probability": float(probabilities[position])}</w:t>
+      </w:r>
+    </w:p>
+    <w:p/>
+    <w:p>
+      <w:r>
+        <w:t>Four finite positive measurements are required. The selected class and its leaf probability are returned together; the CLI explicitly states that this probability is not calibrated confidence.</w:t>
+      </w:r>
+    </w:p>
+    <w:p>
+      <w:pPr>
+        <w:pStyle w:val="Heading2"/>
+      </w:pPr>
+      <w:r>
+        <w:t>Model persistence and dataset export</w:t>
+      </w:r>
+    </w:p>
+    <w:p>
+      <w:r>
+        <w:t>src/iris_demo.py   |   Lines 83 to 98</w:t>
+      </w:r>
+    </w:p>
+    <w:p>
+      <w:pPr>
+        <w:spacing w:after="0" w:line="252" w:lineRule="auto"/>
+      </w:pPr>
+      <w:r>
+        <w:rPr>
+          <w:rFonts w:ascii="Consolas" w:hAnsi="Consolas"/>
+          <w:color w:val="666666"/>
+          <w:sz w:val="18"/>
+        </w:rPr>
+        <w:t xml:space="preserve"> 83  </w:t>
+      </w:r>
+      <w:r>
+        <w:rPr>
+          <w:rFonts w:ascii="Consolas" w:hAnsi="Consolas"/>
+          <w:color w:val="17365D"/>
+          <w:sz w:val="18"/>
+        </w:rPr>
+        <w:t>def save_training_outputs(bundle, metrics, output_dir, data_dir):</w:t>
+      </w:r>
+    </w:p>
+    <w:p>
+      <w:pPr>
+        <w:spacing w:after="0" w:line="252" w:lineRule="auto"/>
+      </w:pPr>
+      <w:r>
+        <w:rPr>
+          <w:rFonts w:ascii="Consolas" w:hAnsi="Consolas"/>
+          <w:color w:val="666666"/>
+          <w:sz w:val="18"/>
+        </w:rPr>
+        <w:t xml:space="preserve"> 84  </w:t>
+      </w:r>
+      <w:r>
+        <w:rPr>
+          <w:rFonts w:ascii="Consolas" w:hAnsi="Consolas"/>
+          <w:sz w:val="18"/>
+        </w:rPr>
+        <w:t xml:space="preserve">    output_dir, data_dir = Path(output_dir), Path(data_dir)</w:t>
+      </w:r>
+    </w:p>
+    <w:p>
+      <w:pPr>
+        <w:spacing w:after="0" w:line="252" w:lineRule="auto"/>
+      </w:pPr>
+      <w:r>
+        <w:rPr>
+          <w:rFonts w:ascii="Consolas" w:hAnsi="Consolas"/>
+          <w:color w:val="666666"/>
+          <w:sz w:val="18"/>
+        </w:rPr>
+        <w:t xml:space="preserve"> 85  </w:t>
+      </w:r>
+      <w:r>
+        <w:rPr>
+          <w:rFonts w:ascii="Consolas" w:hAnsi="Consolas"/>
+          <w:sz w:val="18"/>
+        </w:rPr>
+        <w:t xml:space="preserve">    output_dir.mkdir(parents=True, exist_ok=True)</w:t>
+      </w:r>
+    </w:p>
+    <w:p>
+      <w:pPr>
+        <w:spacing w:after="0" w:line="252" w:lineRule="auto"/>
+      </w:pPr>
+      <w:r>
+        <w:rPr>
+          <w:rFonts w:ascii="Consolas" w:hAnsi="Consolas"/>
+          <w:color w:val="666666"/>
+          <w:sz w:val="18"/>
+        </w:rPr>
+        <w:t xml:space="preserve"> 86  </w:t>
+      </w:r>
+      <w:r>
+        <w:rPr>
+          <w:rFonts w:ascii="Consolas" w:hAnsi="Consolas"/>
+          <w:sz w:val="18"/>
+        </w:rPr>
+        <w:t xml:space="preserve">    data_dir.mkdir(parents=True, exist_ok=True)</w:t>
+      </w:r>
+    </w:p>
+    <w:p>
+      <w:pPr>
+        <w:spacing w:after="0" w:line="252" w:lineRule="auto"/>
+      </w:pPr>
+      <w:r>
+        <w:rPr>
+          <w:rFonts w:ascii="Consolas" w:hAnsi="Consolas"/>
+          <w:color w:val="666666"/>
+          <w:sz w:val="18"/>
+        </w:rPr>
+        <w:t xml:space="preserve"> 87  </w:t>
+      </w:r>
+      <w:r>
+        <w:rPr>
+          <w:rFonts w:ascii="Consolas" w:hAnsi="Consolas"/>
+          <w:sz w:val="18"/>
+        </w:rPr>
+        <w:t xml:space="preserve">    joblib.dump(bundle, output_dir / "iris_model.joblib")</w:t>
+      </w:r>
+    </w:p>
+    <w:p>
+      <w:pPr>
+        <w:spacing w:after="0" w:line="252" w:lineRule="auto"/>
+      </w:pPr>
+      <w:r>
+        <w:rPr>
+          <w:rFonts w:ascii="Consolas" w:hAnsi="Consolas"/>
+          <w:color w:val="666666"/>
+          <w:sz w:val="18"/>
+        </w:rPr>
+        <w:t xml:space="preserve"> 88  </w:t>
+      </w:r>
+      <w:r>
+        <w:rPr>
+          <w:rFonts w:ascii="Consolas" w:hAnsi="Consolas"/>
+          <w:sz w:val="18"/>
+        </w:rPr>
+        <w:t xml:space="preserve">    (output_dir / "metrics.json").write_text(json.dumps(metrics, indent=2), encoding="utf-8")</w:t>
+      </w:r>
+    </w:p>
+    <w:p>
+      <w:pPr>
+        <w:spacing w:after="0" w:line="252" w:lineRule="auto"/>
+      </w:pPr>
+      <w:r>
+        <w:rPr>
+          <w:rFonts w:ascii="Consolas" w:hAnsi="Consolas"/>
+          <w:color w:val="666666"/>
+          <w:sz w:val="18"/>
+        </w:rPr>
+        <w:t xml:space="preserve"> 89  </w:t>
+      </w:r>
+      <w:r>
+        <w:rPr>
+          <w:rFonts w:ascii="Consolas" w:hAnsi="Consolas"/>
+          <w:color w:val="17365D"/>
+          <w:sz w:val="18"/>
+        </w:rPr>
+        <w:t xml:space="preserve">    with (output_dir / "confusion_matrix.csv").open("w", newline="", encoding="utf-8") as f:</w:t>
+      </w:r>
+    </w:p>
+    <w:p>
+      <w:pPr>
+        <w:spacing w:after="0" w:line="252" w:lineRule="auto"/>
+      </w:pPr>
+      <w:r>
+        <w:rPr>
+          <w:rFonts w:ascii="Consolas" w:hAnsi="Consolas"/>
+          <w:color w:val="666666"/>
+          <w:sz w:val="18"/>
+        </w:rPr>
+        <w:t xml:space="preserve"> 90  </w:t>
+      </w:r>
+      <w:r>
+        <w:rPr>
+          <w:rFonts w:ascii="Consolas" w:hAnsi="Consolas"/>
+          <w:sz w:val="18"/>
+        </w:rPr>
+        <w:t xml:space="preserve">        writer = csv.writer(f)</w:t>
+      </w:r>
+    </w:p>
+    <w:p>
+      <w:pPr>
+        <w:spacing w:after="0" w:line="252" w:lineRule="auto"/>
+      </w:pPr>
+      <w:r>
+        <w:rPr>
+          <w:rFonts w:ascii="Consolas" w:hAnsi="Consolas"/>
+          <w:color w:val="666666"/>
+          <w:sz w:val="18"/>
+        </w:rPr>
+        <w:t xml:space="preserve"> 91  </w:t>
+      </w:r>
+      <w:r>
+        <w:rPr>
+          <w:rFonts w:ascii="Consolas" w:hAnsi="Consolas"/>
+          <w:sz w:val="18"/>
+        </w:rPr>
+        <w:t xml:space="preserve">        writer.writerow(["actual / predicted", *metrics["target_names"]])</w:t>
+      </w:r>
+    </w:p>
+    <w:p>
+      <w:pPr>
+        <w:spacing w:after="0" w:line="252" w:lineRule="auto"/>
+      </w:pPr>
+      <w:r>
+        <w:rPr>
+          <w:rFonts w:ascii="Consolas" w:hAnsi="Consolas"/>
+          <w:color w:val="666666"/>
+          <w:sz w:val="18"/>
+        </w:rPr>
+        <w:t xml:space="preserve"> 92  </w:t>
+      </w:r>
+      <w:r>
+        <w:rPr>
+          <w:rFonts w:ascii="Consolas" w:hAnsi="Consolas"/>
+          <w:sz w:val="18"/>
+        </w:rPr>
+        <w:t xml:space="preserve">        writer.writerows(zip(metrics["target_names"], metrics["confusion_matrix"]))</w:t>
+      </w:r>
+    </w:p>
+    <w:p>
+      <w:pPr>
+        <w:spacing w:after="0" w:line="252" w:lineRule="auto"/>
+      </w:pPr>
+      <w:r>
+        <w:rPr>
+          <w:rFonts w:ascii="Consolas" w:hAnsi="Consolas"/>
+          <w:color w:val="666666"/>
+          <w:sz w:val="18"/>
+        </w:rPr>
+        <w:t xml:space="preserve"> 93  </w:t>
+      </w:r>
+      <w:r>
+        <w:rPr>
+          <w:rFonts w:ascii="Consolas" w:hAnsi="Consolas"/>
+          <w:sz w:val="18"/>
+        </w:rPr>
+        <w:t xml:space="preserve">    iris = load_iris()</w:t>
+      </w:r>
+    </w:p>
+    <w:p>
+      <w:pPr>
+        <w:spacing w:after="0" w:line="252" w:lineRule="auto"/>
+      </w:pPr>
+      <w:r>
+        <w:rPr>
+          <w:rFonts w:ascii="Consolas" w:hAnsi="Consolas"/>
+          <w:color w:val="666666"/>
+          <w:sz w:val="18"/>
+        </w:rPr>
+        <w:t xml:space="preserve"> 94  </w:t>
+      </w:r>
+      <w:r>
+        <w:rPr>
+          <w:rFonts w:ascii="Consolas" w:hAnsi="Consolas"/>
+          <w:color w:val="17365D"/>
+          <w:sz w:val="18"/>
+        </w:rPr>
+        <w:t xml:space="preserve">    with (data_dir / "iris.csv").open("w", newline="", encoding="utf-8") as f:</w:t>
+      </w:r>
+    </w:p>
+    <w:p>
+      <w:pPr>
+        <w:spacing w:after="0" w:line="252" w:lineRule="auto"/>
+      </w:pPr>
+      <w:r>
+        <w:rPr>
+          <w:rFonts w:ascii="Consolas" w:hAnsi="Consolas"/>
+          <w:color w:val="666666"/>
+          <w:sz w:val="18"/>
+        </w:rPr>
+        <w:t xml:space="preserve"> 95  </w:t>
+      </w:r>
+      <w:r>
+        <w:rPr>
+          <w:rFonts w:ascii="Consolas" w:hAnsi="Consolas"/>
+          <w:sz w:val="18"/>
+        </w:rPr>
+        <w:t xml:space="preserve">        writer = csv.writer(f)</w:t>
+      </w:r>
+    </w:p>
+    <w:p>
+      <w:pPr>
+        <w:spacing w:after="0" w:line="252" w:lineRule="auto"/>
+      </w:pPr>
+      <w:r>
+        <w:rPr>
+          <w:rFonts w:ascii="Consolas" w:hAnsi="Consolas"/>
+          <w:color w:val="666666"/>
+          <w:sz w:val="18"/>
+        </w:rPr>
+        <w:t xml:space="preserve"> 96  </w:t>
+      </w:r>
+      <w:r>
+        <w:rPr>
+          <w:rFonts w:ascii="Consolas" w:hAnsi="Consolas"/>
+          <w:sz w:val="18"/>
+        </w:rPr>
+        <w:t xml:space="preserve">        writer.writerow([*iris.feature_names, "target", "species"])</w:t>
+      </w:r>
+    </w:p>
+    <w:p>
+      <w:pPr>
+        <w:spacing w:after="0" w:line="252" w:lineRule="auto"/>
+      </w:pPr>
+      <w:r>
+        <w:rPr>
+          <w:rFonts w:ascii="Consolas" w:hAnsi="Consolas"/>
+          <w:color w:val="666666"/>
+          <w:sz w:val="18"/>
+        </w:rPr>
+        <w:t xml:space="preserve"> 97  </w:t>
+      </w:r>
+      <w:r>
+        <w:rPr>
+          <w:rFonts w:ascii="Consolas" w:hAnsi="Consolas"/>
+          <w:sz w:val="18"/>
+        </w:rPr>
+        <w:t xml:space="preserve">        for features, target in zip(iris.data, iris.target):</w:t>
+      </w:r>
+    </w:p>
+    <w:p>
+      <w:pPr>
+        <w:spacing w:after="0" w:line="252" w:lineRule="auto"/>
+      </w:pPr>
+      <w:r>
+        <w:rPr>
+          <w:rFonts w:ascii="Consolas" w:hAnsi="Consolas"/>
+          <w:color w:val="666666"/>
+          <w:sz w:val="18"/>
+        </w:rPr>
+        <w:t xml:space="preserve"> 98  </w:t>
+      </w:r>
+      <w:r>
+        <w:rPr>
+          <w:rFonts w:ascii="Consolas" w:hAnsi="Consolas"/>
+          <w:sz w:val="18"/>
+        </w:rPr>
+        <w:t xml:space="preserve">            writer.writerow([*features, int(target), iris.target_names[target]])</w:t>
+      </w:r>
+    </w:p>
+    <w:p/>
+    <w:p>
+      <w:r>
+        <w:t>joblib saves the model bundle. JSON and CSV preserve evaluation results, and the Iris export makes the dataset inspectable. The automated round-trip test verifies the saved model's predictions.</w:t>
+      </w:r>
+    </w:p>
+    <w:p>
+      <w:r>
+        <w:br w:type="page"/>
+      </w:r>
+    </w:p>
+    <w:p>
+      <w:pPr>
+        <w:pStyle w:val="Heading1"/>
+      </w:pPr>
+      <w:r>
+        <w:t>Automated test code excerpts</w:t>
+      </w:r>
+    </w:p>
+    <w:p>
+      <w:pPr>
+        <w:pStyle w:val="Heading2"/>
+      </w:pPr>
+      <w:r>
+        <w:t>Reproducibility and accuracy acceptance test</w:t>
+      </w:r>
+    </w:p>
+    <w:p>
+      <w:r>
+        <w:t>tests/test_iris_demo.py   |   Lines 40 to 48</w:t>
+      </w:r>
+    </w:p>
+    <w:p>
+      <w:pPr>
+        <w:spacing w:after="0" w:line="252" w:lineRule="auto"/>
+      </w:pPr>
+      <w:r>
+        <w:rPr>
+          <w:rFonts w:ascii="Consolas" w:hAnsi="Consolas"/>
+          <w:color w:val="666666"/>
+          <w:sz w:val="18"/>
+        </w:rPr>
+        <w:t xml:space="preserve"> 40  </w:t>
+      </w:r>
+      <w:r>
+        <w:rPr>
+          <w:rFonts w:ascii="Consolas" w:hAnsi="Consolas"/>
+          <w:color w:val="17365D"/>
+          <w:sz w:val="18"/>
+        </w:rPr>
+        <w:t>def test_training_is_reproducible_and_meets_acceptance():</w:t>
+      </w:r>
+    </w:p>
+    <w:p>
+      <w:pPr>
+        <w:spacing w:after="0" w:line="252" w:lineRule="auto"/>
+      </w:pPr>
+      <w:r>
+        <w:rPr>
+          <w:rFonts w:ascii="Consolas" w:hAnsi="Consolas"/>
+          <w:color w:val="666666"/>
+          <w:sz w:val="18"/>
+        </w:rPr>
+        <w:t xml:space="preserve"> 41  </w:t>
+      </w:r>
+      <w:r>
+        <w:rPr>
+          <w:rFonts w:ascii="Consolas" w:hAnsi="Consolas"/>
+          <w:sz w:val="18"/>
+        </w:rPr>
+        <w:t xml:space="preserve">    first, metrics = train_model()</w:t>
+      </w:r>
+    </w:p>
+    <w:p>
+      <w:pPr>
+        <w:spacing w:after="0" w:line="252" w:lineRule="auto"/>
+      </w:pPr>
+      <w:r>
+        <w:rPr>
+          <w:rFonts w:ascii="Consolas" w:hAnsi="Consolas"/>
+          <w:color w:val="666666"/>
+          <w:sz w:val="18"/>
+        </w:rPr>
+        <w:t xml:space="preserve"> 42  </w:t>
+      </w:r>
+      <w:r>
+        <w:rPr>
+          <w:rFonts w:ascii="Consolas" w:hAnsi="Consolas"/>
+          <w:sz w:val="18"/>
+        </w:rPr>
+        <w:t xml:space="preserve">    second, repeated = train_model()</w:t>
+      </w:r>
+    </w:p>
+    <w:p>
+      <w:pPr>
+        <w:spacing w:after="0" w:line="252" w:lineRule="auto"/>
+      </w:pPr>
+      <w:r>
+        <w:rPr>
+          <w:rFonts w:ascii="Consolas" w:hAnsi="Consolas"/>
+          <w:color w:val="666666"/>
+          <w:sz w:val="18"/>
+        </w:rPr>
+        <w:t xml:space="preserve"> 43  </w:t>
+      </w:r>
+      <w:r>
+        <w:rPr>
+          <w:rFonts w:ascii="Consolas" w:hAnsi="Consolas"/>
+          <w:sz w:val="18"/>
+        </w:rPr>
+        <w:t xml:space="preserve">    assert metrics == repeated</w:t>
+      </w:r>
+    </w:p>
+    <w:p>
+      <w:pPr>
+        <w:spacing w:after="0" w:line="252" w:lineRule="auto"/>
+      </w:pPr>
+      <w:r>
+        <w:rPr>
+          <w:rFonts w:ascii="Consolas" w:hAnsi="Consolas"/>
+          <w:color w:val="666666"/>
+          <w:sz w:val="18"/>
+        </w:rPr>
+        <w:t xml:space="preserve"> 44  </w:t>
+      </w:r>
+      <w:r>
+        <w:rPr>
+          <w:rFonts w:ascii="Consolas" w:hAnsi="Consolas"/>
+          <w:sz w:val="18"/>
+        </w:rPr>
+        <w:t xml:space="preserve">    assert metrics["accuracy"] &gt;= 0.95</w:t>
+      </w:r>
+    </w:p>
+    <w:p>
+      <w:pPr>
+        <w:spacing w:after="0" w:line="252" w:lineRule="auto"/>
+      </w:pPr>
+      <w:r>
+        <w:rPr>
+          <w:rFonts w:ascii="Consolas" w:hAnsi="Consolas"/>
+          <w:color w:val="666666"/>
+          <w:sz w:val="18"/>
+        </w:rPr>
+        <w:t xml:space="preserve"> 45  </w:t>
+      </w:r>
+      <w:r>
+        <w:rPr>
+          <w:rFonts w:ascii="Consolas" w:hAnsi="Consolas"/>
+          <w:sz w:val="18"/>
+        </w:rPr>
+        <w:t xml:space="preserve">    assert metrics["train_rows"] == 120 and metrics["test_rows"] == 30</w:t>
+      </w:r>
+    </w:p>
+    <w:p>
+      <w:pPr>
+        <w:spacing w:after="0" w:line="252" w:lineRule="auto"/>
+      </w:pPr>
+      <w:r>
+        <w:rPr>
+          <w:rFonts w:ascii="Consolas" w:hAnsi="Consolas"/>
+          <w:color w:val="666666"/>
+          <w:sz w:val="18"/>
+        </w:rPr>
+        <w:t xml:space="preserve"> 46  </w:t>
+      </w:r>
+      <w:r>
+        <w:rPr>
+          <w:rFonts w:ascii="Consolas" w:hAnsi="Consolas"/>
+          <w:sz w:val="18"/>
+        </w:rPr>
+        <w:t xml:space="preserve">    assert sum(map(sum, metrics["confusion_matrix"])) == 30</w:t>
+      </w:r>
+    </w:p>
+    <w:p>
+      <w:pPr>
+        <w:spacing w:after="0" w:line="252" w:lineRule="auto"/>
+      </w:pPr>
+      <w:r>
+        <w:rPr>
+          <w:rFonts w:ascii="Consolas" w:hAnsi="Consolas"/>
+          <w:color w:val="666666"/>
+          <w:sz w:val="18"/>
+        </w:rPr>
+        <w:t xml:space="preserve"> 47  </w:t>
+      </w:r>
+      <w:r>
+        <w:rPr>
+          <w:rFonts w:ascii="Consolas" w:hAnsi="Consolas"/>
+          <w:sz w:val="18"/>
+        </w:rPr>
+        <w:t xml:space="preserve">    np.testing.assert_array_equal(first["model"].predict(load_iris().data),</w:t>
+      </w:r>
+    </w:p>
+    <w:p>
+      <w:pPr>
+        <w:spacing w:after="0" w:line="252" w:lineRule="auto"/>
+      </w:pPr>
+      <w:r>
+        <w:rPr>
+          <w:rFonts w:ascii="Consolas" w:hAnsi="Consolas"/>
+          <w:color w:val="666666"/>
+          <w:sz w:val="18"/>
+        </w:rPr>
+        <w:t xml:space="preserve"> 48  </w:t>
+      </w:r>
+      <w:r>
+        <w:rPr>
+          <w:rFonts w:ascii="Consolas" w:hAnsi="Consolas"/>
+          <w:sz w:val="18"/>
+        </w:rPr>
+        <w:t xml:space="preserve">                                  second["model"].predict(load_iris().data))</w:t>
+      </w:r>
+    </w:p>
+    <w:p/>
+    <w:p>
+      <w:r>
+        <w:t>This test verifies the 95% threshold, the 120/30 split, the confusion-matrix total and agreement between repeated model predictions.</w:t>
+      </w:r>
+    </w:p>
+    <w:p>
+      <w:pPr>
+        <w:pStyle w:val="Heading2"/>
+      </w:pPr>
+      <w:r>
+        <w:t>Saved model round trip test</w:t>
+      </w:r>
+    </w:p>
+    <w:p>
+      <w:r>
+        <w:t>tests/test_iris_demo.py   |   Lines 78 to 87</w:t>
+      </w:r>
+    </w:p>
+    <w:p>
+      <w:pPr>
+        <w:spacing w:after="0" w:line="252" w:lineRule="auto"/>
+      </w:pPr>
+      <w:r>
+        <w:rPr>
+          <w:rFonts w:ascii="Consolas" w:hAnsi="Consolas"/>
+          <w:color w:val="666666"/>
+          <w:sz w:val="18"/>
+        </w:rPr>
+        <w:t xml:space="preserve"> 78  </w:t>
+      </w:r>
+      <w:r>
+        <w:rPr>
+          <w:rFonts w:ascii="Consolas" w:hAnsi="Consolas"/>
+          <w:color w:val="17365D"/>
+          <w:sz w:val="18"/>
+        </w:rPr>
+        <w:t>def test_saved_model_and_reports_roundtrip(tmp_path):</w:t>
+      </w:r>
+    </w:p>
+    <w:p>
+      <w:pPr>
+        <w:spacing w:after="0" w:line="252" w:lineRule="auto"/>
+      </w:pPr>
+      <w:r>
+        <w:rPr>
+          <w:rFonts w:ascii="Consolas" w:hAnsi="Consolas"/>
+          <w:color w:val="666666"/>
+          <w:sz w:val="18"/>
+        </w:rPr>
+        <w:t xml:space="preserve"> 79  </w:t>
+      </w:r>
+      <w:r>
+        <w:rPr>
+          <w:rFonts w:ascii="Consolas" w:hAnsi="Consolas"/>
+          <w:sz w:val="18"/>
+        </w:rPr>
+        <w:t xml:space="preserve">    bundle, metrics = train_model()</w:t>
+      </w:r>
+    </w:p>
+    <w:p>
+      <w:pPr>
+        <w:spacing w:after="0" w:line="252" w:lineRule="auto"/>
+      </w:pPr>
+      <w:r>
+        <w:rPr>
+          <w:rFonts w:ascii="Consolas" w:hAnsi="Consolas"/>
+          <w:color w:val="666666"/>
+          <w:sz w:val="18"/>
+        </w:rPr>
+        <w:t xml:space="preserve"> 80  </w:t>
+      </w:r>
+      <w:r>
+        <w:rPr>
+          <w:rFonts w:ascii="Consolas" w:hAnsi="Consolas"/>
+          <w:sz w:val="18"/>
+        </w:rPr>
+        <w:t xml:space="preserve">    output, data = tmp_path / "models", tmp_path / "data"</w:t>
+      </w:r>
+    </w:p>
+    <w:p>
+      <w:pPr>
+        <w:spacing w:after="0" w:line="252" w:lineRule="auto"/>
+      </w:pPr>
+      <w:r>
+        <w:rPr>
+          <w:rFonts w:ascii="Consolas" w:hAnsi="Consolas"/>
+          <w:color w:val="666666"/>
+          <w:sz w:val="18"/>
+        </w:rPr>
+        <w:t xml:space="preserve"> 81  </w:t>
+      </w:r>
+      <w:r>
+        <w:rPr>
+          <w:rFonts w:ascii="Consolas" w:hAnsi="Consolas"/>
+          <w:sz w:val="18"/>
+        </w:rPr>
+        <w:t xml:space="preserve">    save_training_outputs(bundle, metrics, output, data)</w:t>
+      </w:r>
+    </w:p>
+    <w:p>
+      <w:pPr>
+        <w:spacing w:after="0" w:line="252" w:lineRule="auto"/>
+      </w:pPr>
+      <w:r>
+        <w:rPr>
+          <w:rFonts w:ascii="Consolas" w:hAnsi="Consolas"/>
+          <w:color w:val="666666"/>
+          <w:sz w:val="18"/>
+        </w:rPr>
+        <w:t xml:space="preserve"> 82  </w:t>
+      </w:r>
+      <w:r>
+        <w:rPr>
+          <w:rFonts w:ascii="Consolas" w:hAnsi="Consolas"/>
+          <w:sz w:val="18"/>
+        </w:rPr>
+        <w:t xml:space="preserve">    loaded = joblib.load(output / "iris_model.joblib")</w:t>
+      </w:r>
+    </w:p>
+    <w:p>
+      <w:pPr>
+        <w:spacing w:after="0" w:line="252" w:lineRule="auto"/>
+      </w:pPr>
+      <w:r>
+        <w:rPr>
+          <w:rFonts w:ascii="Consolas" w:hAnsi="Consolas"/>
+          <w:color w:val="666666"/>
+          <w:sz w:val="18"/>
+        </w:rPr>
+        <w:t xml:space="preserve"> 83  </w:t>
+      </w:r>
+      <w:r>
+        <w:rPr>
+          <w:rFonts w:ascii="Consolas" w:hAnsi="Consolas"/>
+          <w:sz w:val="18"/>
+        </w:rPr>
+        <w:t xml:space="preserve">    np.testing.assert_array_equal(bundle["model"].predict(load_iris().data),</w:t>
+      </w:r>
+    </w:p>
+    <w:p>
+      <w:pPr>
+        <w:spacing w:after="0" w:line="252" w:lineRule="auto"/>
+      </w:pPr>
+      <w:r>
+        <w:rPr>
+          <w:rFonts w:ascii="Consolas" w:hAnsi="Consolas"/>
+          <w:color w:val="666666"/>
+          <w:sz w:val="18"/>
+        </w:rPr>
+        <w:t xml:space="preserve"> 84  </w:t>
+      </w:r>
+      <w:r>
+        <w:rPr>
+          <w:rFonts w:ascii="Consolas" w:hAnsi="Consolas"/>
+          <w:sz w:val="18"/>
+        </w:rPr>
+        <w:t xml:space="preserve">                                  loaded["model"].predict(load_iris().data))</w:t>
+      </w:r>
+    </w:p>
+    <w:p>
+      <w:pPr>
+        <w:spacing w:after="0" w:line="252" w:lineRule="auto"/>
+      </w:pPr>
+      <w:r>
+        <w:rPr>
+          <w:rFonts w:ascii="Consolas" w:hAnsi="Consolas"/>
+          <w:color w:val="666666"/>
+          <w:sz w:val="18"/>
+        </w:rPr>
+        <w:t xml:space="preserve"> 85  </w:t>
+      </w:r>
+      <w:r>
+        <w:rPr>
+          <w:rFonts w:ascii="Consolas" w:hAnsi="Consolas"/>
+          <w:sz w:val="18"/>
+        </w:rPr>
+        <w:t xml:space="preserve">    assert json.loads((output / "metrics.json").read_text()) == metrics</w:t>
+      </w:r>
+    </w:p>
+    <w:p>
+      <w:pPr>
+        <w:spacing w:after="0" w:line="252" w:lineRule="auto"/>
+      </w:pPr>
+      <w:r>
+        <w:rPr>
+          <w:rFonts w:ascii="Consolas" w:hAnsi="Consolas"/>
+          <w:color w:val="666666"/>
+          <w:sz w:val="18"/>
+        </w:rPr>
+        <w:t xml:space="preserve"> 86  </w:t>
+      </w:r>
+      <w:r>
+        <w:rPr>
+          <w:rFonts w:ascii="Consolas" w:hAnsi="Consolas"/>
+          <w:sz w:val="18"/>
+        </w:rPr>
+        <w:t xml:space="preserve">    assert len((data / "iris.csv").read_text().splitlines()) == 151</w:t>
+      </w:r>
+    </w:p>
+    <w:p>
+      <w:pPr>
+        <w:spacing w:after="0" w:line="252" w:lineRule="auto"/>
+      </w:pPr>
+      <w:r>
+        <w:rPr>
+          <w:rFonts w:ascii="Consolas" w:hAnsi="Consolas"/>
+          <w:color w:val="666666"/>
+          <w:sz w:val="18"/>
+        </w:rPr>
+        <w:t xml:space="preserve"> 87  </w:t>
+      </w:r>
+      <w:r>
+        <w:rPr>
+          <w:rFonts w:ascii="Consolas" w:hAnsi="Consolas"/>
+          <w:sz w:val="18"/>
+        </w:rPr>
+        <w:t xml:space="preserve">    assert len((output / "confusion_matrix.csv").read_text().splitlines()) == 4</w:t>
+      </w:r>
+    </w:p>
+    <w:p/>
+    <w:p>
+      <w:r>
+        <w:t>The model is saved in an isolated temporary directory, loaded again, and checked against its original predictions. The report and exported dataset are also verified.</w:t>
+      </w:r>
+    </w:p>
+    <w:p>
+      <w:pPr>
+        <w:spacing w:line="240" w:lineRule="auto"/>
+      </w:pPr>
+      <w:r>
+        <w:rPr>
+          <w:rFonts w:ascii="Consolas" w:hAnsi="Consolas"/>
+          <w:sz w:val="18"/>
+        </w:rPr>
+        <w:t>python -m pytest -q --junitxml=reports/junit.xml</w:t>
+        <w:br/>
+        <w:t>19 passed</w:t>
+      </w:r>
+    </w:p>
+    <w:p>
+      <w:r>
+        <w:br w:type="page"/>
+      </w:r>
+    </w:p>
+    <w:p>
+      <w:pPr>
+        <w:pStyle w:val="Heading1"/>
+      </w:pPr>
+      <w:r>
+        <w:t>GitHub Actions workflow excerpts</w:t>
+      </w:r>
+    </w:p>
+    <w:p>
+      <w:pPr>
+        <w:pStyle w:val="Heading2"/>
+      </w:pPr>
+      <w:r>
+        <w:t>Automated test job</w:t>
+      </w:r>
+    </w:p>
+    <w:p>
+      <w:r>
+        <w:t>.github/workflows/ci.yml   |   Lines 11 to 32</w:t>
+      </w:r>
+    </w:p>
+    <w:p>
+      <w:pPr>
+        <w:spacing w:after="0" w:line="252" w:lineRule="auto"/>
+      </w:pPr>
+      <w:r>
+        <w:rPr>
+          <w:rFonts w:ascii="Consolas" w:hAnsi="Consolas"/>
+          <w:color w:val="666666"/>
+          <w:sz w:val="18"/>
+        </w:rPr>
+        <w:t xml:space="preserve"> 11  </w:t>
+      </w:r>
+      <w:r>
+        <w:rPr>
+          <w:rFonts w:ascii="Consolas" w:hAnsi="Consolas"/>
+          <w:sz w:val="18"/>
+        </w:rPr>
+        <w:t>jobs:</w:t>
+      </w:r>
+    </w:p>
+    <w:p>
+      <w:pPr>
+        <w:spacing w:after="0" w:line="252" w:lineRule="auto"/>
+      </w:pPr>
+      <w:r>
+        <w:rPr>
+          <w:rFonts w:ascii="Consolas" w:hAnsi="Consolas"/>
+          <w:color w:val="666666"/>
+          <w:sz w:val="18"/>
+        </w:rPr>
+        <w:t xml:space="preserve"> 12  </w:t>
+      </w:r>
+      <w:r>
+        <w:rPr>
+          <w:rFonts w:ascii="Consolas" w:hAnsi="Consolas"/>
+          <w:sz w:val="18"/>
+        </w:rPr>
+        <w:t xml:space="preserve">  test:</w:t>
+      </w:r>
+    </w:p>
+    <w:p>
+      <w:pPr>
+        <w:spacing w:after="0" w:line="252" w:lineRule="auto"/>
+      </w:pPr>
+      <w:r>
+        <w:rPr>
+          <w:rFonts w:ascii="Consolas" w:hAnsi="Consolas"/>
+          <w:color w:val="666666"/>
+          <w:sz w:val="18"/>
+        </w:rPr>
+        <w:t xml:space="preserve"> 13  </w:t>
+      </w:r>
+      <w:r>
+        <w:rPr>
+          <w:rFonts w:ascii="Consolas" w:hAnsi="Consolas"/>
+          <w:sz w:val="18"/>
+        </w:rPr>
+        <w:t xml:space="preserve">    name: Validate and test</w:t>
+      </w:r>
+    </w:p>
+    <w:p>
+      <w:pPr>
+        <w:spacing w:after="0" w:line="252" w:lineRule="auto"/>
+      </w:pPr>
+      <w:r>
+        <w:rPr>
+          <w:rFonts w:ascii="Consolas" w:hAnsi="Consolas"/>
+          <w:color w:val="666666"/>
+          <w:sz w:val="18"/>
+        </w:rPr>
+        <w:t xml:space="preserve"> 14  </w:t>
+      </w:r>
+      <w:r>
+        <w:rPr>
+          <w:rFonts w:ascii="Consolas" w:hAnsi="Consolas"/>
+          <w:sz w:val="18"/>
+        </w:rPr>
+        <w:t xml:space="preserve">    runs-on: ubuntu-24.04</w:t>
+      </w:r>
+    </w:p>
+    <w:p>
+      <w:pPr>
+        <w:spacing w:after="0" w:line="252" w:lineRule="auto"/>
+      </w:pPr>
+      <w:r>
+        <w:rPr>
+          <w:rFonts w:ascii="Consolas" w:hAnsi="Consolas"/>
+          <w:color w:val="666666"/>
+          <w:sz w:val="18"/>
+        </w:rPr>
+        <w:t xml:space="preserve"> 15  </w:t>
+      </w:r>
+      <w:r>
+        <w:rPr>
+          <w:rFonts w:ascii="Consolas" w:hAnsi="Consolas"/>
+          <w:sz w:val="18"/>
+        </w:rPr>
+        <w:t xml:space="preserve">    steps:</w:t>
+      </w:r>
+    </w:p>
+    <w:p>
+      <w:pPr>
+        <w:spacing w:after="0" w:line="252" w:lineRule="auto"/>
+      </w:pPr>
+      <w:r>
+        <w:rPr>
+          <w:rFonts w:ascii="Consolas" w:hAnsi="Consolas"/>
+          <w:color w:val="666666"/>
+          <w:sz w:val="18"/>
+        </w:rPr>
+        <w:t xml:space="preserve"> 16  </w:t>
+      </w:r>
+      <w:r>
+        <w:rPr>
+          <w:rFonts w:ascii="Consolas" w:hAnsi="Consolas"/>
+          <w:sz w:val="18"/>
+        </w:rPr>
+        <w:t xml:space="preserve">      - uses: actions/checkout@v7</w:t>
+      </w:r>
+    </w:p>
+    <w:p>
+      <w:pPr>
+        <w:spacing w:after="0" w:line="252" w:lineRule="auto"/>
+      </w:pPr>
+      <w:r>
+        <w:rPr>
+          <w:rFonts w:ascii="Consolas" w:hAnsi="Consolas"/>
+          <w:color w:val="666666"/>
+          <w:sz w:val="18"/>
+        </w:rPr>
+        <w:t xml:space="preserve"> 17  </w:t>
+      </w:r>
+      <w:r>
+        <w:rPr>
+          <w:rFonts w:ascii="Consolas" w:hAnsi="Consolas"/>
+          <w:sz w:val="18"/>
+        </w:rPr>
+        <w:t xml:space="preserve">      - uses: actions/setup-python@v7</w:t>
+      </w:r>
+    </w:p>
+    <w:p>
+      <w:pPr>
+        <w:spacing w:after="0" w:line="252" w:lineRule="auto"/>
+      </w:pPr>
+      <w:r>
+        <w:rPr>
+          <w:rFonts w:ascii="Consolas" w:hAnsi="Consolas"/>
+          <w:color w:val="666666"/>
+          <w:sz w:val="18"/>
+        </w:rPr>
+        <w:t xml:space="preserve"> 18  </w:t>
+      </w:r>
+      <w:r>
+        <w:rPr>
+          <w:rFonts w:ascii="Consolas" w:hAnsi="Consolas"/>
+          <w:sz w:val="18"/>
+        </w:rPr>
+        <w:t xml:space="preserve">        with:</w:t>
+      </w:r>
+    </w:p>
+    <w:p>
+      <w:pPr>
+        <w:spacing w:after="0" w:line="252" w:lineRule="auto"/>
+      </w:pPr>
+      <w:r>
+        <w:rPr>
+          <w:rFonts w:ascii="Consolas" w:hAnsi="Consolas"/>
+          <w:color w:val="666666"/>
+          <w:sz w:val="18"/>
+        </w:rPr>
+        <w:t xml:space="preserve"> 19  </w:t>
+      </w:r>
+      <w:r>
+        <w:rPr>
+          <w:rFonts w:ascii="Consolas" w:hAnsi="Consolas"/>
+          <w:sz w:val="18"/>
+        </w:rPr>
+        <w:t xml:space="preserve">          python-version: '3.11'</w:t>
+      </w:r>
+    </w:p>
+    <w:p>
+      <w:pPr>
+        <w:spacing w:after="0" w:line="252" w:lineRule="auto"/>
+      </w:pPr>
+      <w:r>
+        <w:rPr>
+          <w:rFonts w:ascii="Consolas" w:hAnsi="Consolas"/>
+          <w:color w:val="666666"/>
+          <w:sz w:val="18"/>
+        </w:rPr>
+        <w:t xml:space="preserve"> 20  </w:t>
+      </w:r>
+      <w:r>
+        <w:rPr>
+          <w:rFonts w:ascii="Consolas" w:hAnsi="Consolas"/>
+          <w:sz w:val="18"/>
+        </w:rPr>
+        <w:t xml:space="preserve">          cache: pip</w:t>
+      </w:r>
+    </w:p>
+    <w:p>
+      <w:pPr>
+        <w:spacing w:after="0" w:line="252" w:lineRule="auto"/>
+      </w:pPr>
+      <w:r>
+        <w:rPr>
+          <w:rFonts w:ascii="Consolas" w:hAnsi="Consolas"/>
+          <w:color w:val="666666"/>
+          <w:sz w:val="18"/>
+        </w:rPr>
+        <w:t xml:space="preserve"> 21  </w:t>
+      </w:r>
+      <w:r>
+        <w:rPr>
+          <w:rFonts w:ascii="Consolas" w:hAnsi="Consolas"/>
+          <w:sz w:val="18"/>
+        </w:rPr>
+        <w:t xml:space="preserve">      - name: Install pinned dependencies</w:t>
+      </w:r>
+    </w:p>
+    <w:p>
+      <w:pPr>
+        <w:spacing w:after="0" w:line="252" w:lineRule="auto"/>
+      </w:pPr>
+      <w:r>
+        <w:rPr>
+          <w:rFonts w:ascii="Consolas" w:hAnsi="Consolas"/>
+          <w:color w:val="666666"/>
+          <w:sz w:val="18"/>
+        </w:rPr>
+        <w:t xml:space="preserve"> 22  </w:t>
+      </w:r>
+      <w:r>
+        <w:rPr>
+          <w:rFonts w:ascii="Consolas" w:hAnsi="Consolas"/>
+          <w:sz w:val="18"/>
+        </w:rPr>
+        <w:t xml:space="preserve">        run: python -m pip install -r requirements-dev.txt</w:t>
+      </w:r>
+    </w:p>
+    <w:p>
+      <w:pPr>
+        <w:spacing w:after="0" w:line="252" w:lineRule="auto"/>
+      </w:pPr>
+      <w:r>
+        <w:rPr>
+          <w:rFonts w:ascii="Consolas" w:hAnsi="Consolas"/>
+          <w:color w:val="666666"/>
+          <w:sz w:val="18"/>
+        </w:rPr>
+        <w:t xml:space="preserve"> 23  </w:t>
+      </w:r>
+      <w:r>
+        <w:rPr>
+          <w:rFonts w:ascii="Consolas" w:hAnsi="Consolas"/>
+          <w:sz w:val="18"/>
+        </w:rPr>
+        <w:t xml:space="preserve">      - name: Run acceptance tests</w:t>
+      </w:r>
+    </w:p>
+    <w:p>
+      <w:pPr>
+        <w:spacing w:after="0" w:line="252" w:lineRule="auto"/>
+      </w:pPr>
+      <w:r>
+        <w:rPr>
+          <w:rFonts w:ascii="Consolas" w:hAnsi="Consolas"/>
+          <w:color w:val="666666"/>
+          <w:sz w:val="18"/>
+        </w:rPr>
+        <w:t xml:space="preserve"> 24  </w:t>
+      </w:r>
+      <w:r>
+        <w:rPr>
+          <w:rFonts w:ascii="Consolas" w:hAnsi="Consolas"/>
+          <w:sz w:val="18"/>
+        </w:rPr>
+        <w:t xml:space="preserve">        run: python -m pytest -q --junitxml=reports/junit.xml</w:t>
+      </w:r>
+    </w:p>
+    <w:p>
+      <w:pPr>
+        <w:spacing w:after="0" w:line="252" w:lineRule="auto"/>
+      </w:pPr>
+      <w:r>
+        <w:rPr>
+          <w:rFonts w:ascii="Consolas" w:hAnsi="Consolas"/>
+          <w:color w:val="666666"/>
+          <w:sz w:val="18"/>
+        </w:rPr>
+        <w:t xml:space="preserve"> 25  </w:t>
+      </w:r>
+      <w:r>
+        <w:rPr>
+          <w:rFonts w:ascii="Consolas" w:hAnsi="Consolas"/>
+          <w:sz w:val="18"/>
+        </w:rPr>
+        <w:t xml:space="preserve">      - name: Upload test results</w:t>
+      </w:r>
+    </w:p>
+    <w:p>
+      <w:pPr>
+        <w:spacing w:after="0" w:line="252" w:lineRule="auto"/>
+      </w:pPr>
+      <w:r>
+        <w:rPr>
+          <w:rFonts w:ascii="Consolas" w:hAnsi="Consolas"/>
+          <w:color w:val="666666"/>
+          <w:sz w:val="18"/>
+        </w:rPr>
+        <w:t xml:space="preserve"> 26  </w:t>
+      </w:r>
+      <w:r>
+        <w:rPr>
+          <w:rFonts w:ascii="Consolas" w:hAnsi="Consolas"/>
+          <w:sz w:val="18"/>
+        </w:rPr>
+        <w:t xml:space="preserve">        if: always()</w:t>
+      </w:r>
+    </w:p>
+    <w:p>
+      <w:pPr>
+        <w:spacing w:after="0" w:line="252" w:lineRule="auto"/>
+      </w:pPr>
+      <w:r>
+        <w:rPr>
+          <w:rFonts w:ascii="Consolas" w:hAnsi="Consolas"/>
+          <w:color w:val="666666"/>
+          <w:sz w:val="18"/>
+        </w:rPr>
+        <w:t xml:space="preserve"> 27  </w:t>
+      </w:r>
+      <w:r>
+        <w:rPr>
+          <w:rFonts w:ascii="Consolas" w:hAnsi="Consolas"/>
+          <w:sz w:val="18"/>
+        </w:rPr>
+        <w:t xml:space="preserve">        uses: actions/upload-artifact@v7</w:t>
+      </w:r>
+    </w:p>
+    <w:p>
+      <w:pPr>
+        <w:spacing w:after="0" w:line="252" w:lineRule="auto"/>
+      </w:pPr>
+      <w:r>
+        <w:rPr>
+          <w:rFonts w:ascii="Consolas" w:hAnsi="Consolas"/>
+          <w:color w:val="666666"/>
+          <w:sz w:val="18"/>
+        </w:rPr>
+        <w:t xml:space="preserve"> 28  </w:t>
+      </w:r>
+      <w:r>
+        <w:rPr>
+          <w:rFonts w:ascii="Consolas" w:hAnsi="Consolas"/>
+          <w:sz w:val="18"/>
+        </w:rPr>
+        <w:t xml:space="preserve">        with:</w:t>
+      </w:r>
+    </w:p>
+    <w:p>
+      <w:pPr>
+        <w:spacing w:after="0" w:line="252" w:lineRule="auto"/>
+      </w:pPr>
+      <w:r>
+        <w:rPr>
+          <w:rFonts w:ascii="Consolas" w:hAnsi="Consolas"/>
+          <w:color w:val="666666"/>
+          <w:sz w:val="18"/>
+        </w:rPr>
+        <w:t xml:space="preserve"> 29  </w:t>
+      </w:r>
+      <w:r>
+        <w:rPr>
+          <w:rFonts w:ascii="Consolas" w:hAnsi="Consolas"/>
+          <w:sz w:val="18"/>
+        </w:rPr>
+        <w:t xml:space="preserve">          name: test-results-${{ github.run_id }}-${{ github.run_attempt }}</w:t>
+      </w:r>
+    </w:p>
+    <w:p>
+      <w:pPr>
+        <w:spacing w:after="0" w:line="252" w:lineRule="auto"/>
+      </w:pPr>
+      <w:r>
+        <w:rPr>
+          <w:rFonts w:ascii="Consolas" w:hAnsi="Consolas"/>
+          <w:color w:val="666666"/>
+          <w:sz w:val="18"/>
+        </w:rPr>
+        <w:t xml:space="preserve"> 30  </w:t>
+      </w:r>
+      <w:r>
+        <w:rPr>
+          <w:rFonts w:ascii="Consolas" w:hAnsi="Consolas"/>
+          <w:sz w:val="18"/>
+        </w:rPr>
+        <w:t xml:space="preserve">          path: reports/junit.xml</w:t>
+      </w:r>
+    </w:p>
+    <w:p>
+      <w:pPr>
+        <w:spacing w:after="0" w:line="252" w:lineRule="auto"/>
+      </w:pPr>
+      <w:r>
+        <w:rPr>
+          <w:rFonts w:ascii="Consolas" w:hAnsi="Consolas"/>
+          <w:color w:val="666666"/>
+          <w:sz w:val="18"/>
+        </w:rPr>
+        <w:t xml:space="preserve"> 31  </w:t>
+      </w:r>
+      <w:r>
+        <w:rPr>
+          <w:rFonts w:ascii="Consolas" w:hAnsi="Consolas"/>
+          <w:sz w:val="18"/>
+        </w:rPr>
+        <w:t xml:space="preserve">          if-no-files-found: warn</w:t>
+      </w:r>
+    </w:p>
+    <w:p>
+      <w:pPr>
+        <w:spacing w:after="0" w:line="252" w:lineRule="auto"/>
+      </w:pPr>
+      <w:r>
+        <w:rPr>
+          <w:rFonts w:ascii="Consolas" w:hAnsi="Consolas"/>
+          <w:color w:val="666666"/>
+          <w:sz w:val="18"/>
+        </w:rPr>
+        <w:t xml:space="preserve"> 32  </w:t>
+      </w:r>
+      <w:r>
+        <w:rPr>
+          <w:rFonts w:ascii="Consolas" w:hAnsi="Consolas"/>
+          <w:sz w:val="18"/>
+        </w:rPr>
+        <w:t xml:space="preserve">          retention-days: 90</w:t>
+      </w:r>
+    </w:p>
+    <w:p/>
+    <w:p>
+      <w:r>
+        <w:t>Every push and pull request runs this job with Python 3.11. The JUnit test-results artifact is uploaded even when tests fail, provided the report exists.</w:t>
+      </w:r>
+    </w:p>
+    <w:p>
+      <w:pPr>
+        <w:pStyle w:val="Heading2"/>
+      </w:pPr>
+      <w:r>
+        <w:t>Dependent delivery job</w:t>
+      </w:r>
+    </w:p>
+    <w:p>
+      <w:r>
+        <w:t>.github/workflows/ci.yml   |   Lines 34 to 57</w:t>
+      </w:r>
+    </w:p>
+    <w:p>
+      <w:pPr>
+        <w:spacing w:after="0" w:line="252" w:lineRule="auto"/>
+      </w:pPr>
+      <w:r>
+        <w:rPr>
+          <w:rFonts w:ascii="Consolas" w:hAnsi="Consolas"/>
+          <w:color w:val="666666"/>
+          <w:sz w:val="18"/>
+        </w:rPr>
+        <w:t xml:space="preserve"> 34  </w:t>
+      </w:r>
+      <w:r>
+        <w:rPr>
+          <w:rFonts w:ascii="Consolas" w:hAnsi="Consolas"/>
+          <w:sz w:val="18"/>
+        </w:rPr>
+        <w:t xml:space="preserve">  deliver:</w:t>
+      </w:r>
+    </w:p>
+    <w:p>
+      <w:pPr>
+        <w:spacing w:after="0" w:line="252" w:lineRule="auto"/>
+      </w:pPr>
+      <w:r>
+        <w:rPr>
+          <w:rFonts w:ascii="Consolas" w:hAnsi="Consolas"/>
+          <w:color w:val="666666"/>
+          <w:sz w:val="18"/>
+        </w:rPr>
+        <w:t xml:space="preserve"> 35  </w:t>
+      </w:r>
+      <w:r>
+        <w:rPr>
+          <w:rFonts w:ascii="Consolas" w:hAnsi="Consolas"/>
+          <w:sz w:val="18"/>
+        </w:rPr>
+        <w:t xml:space="preserve">    name: Train and deliver</w:t>
+      </w:r>
+    </w:p>
+    <w:p>
+      <w:pPr>
+        <w:spacing w:after="0" w:line="252" w:lineRule="auto"/>
+      </w:pPr>
+      <w:r>
+        <w:rPr>
+          <w:rFonts w:ascii="Consolas" w:hAnsi="Consolas"/>
+          <w:color w:val="666666"/>
+          <w:sz w:val="18"/>
+        </w:rPr>
+        <w:t xml:space="preserve"> 36  </w:t>
+      </w:r>
+      <w:r>
+        <w:rPr>
+          <w:rFonts w:ascii="Consolas" w:hAnsi="Consolas"/>
+          <w:sz w:val="18"/>
+        </w:rPr>
+        <w:t xml:space="preserve">    needs: test</w:t>
+      </w:r>
+    </w:p>
+    <w:p>
+      <w:pPr>
+        <w:spacing w:after="0" w:line="252" w:lineRule="auto"/>
+      </w:pPr>
+      <w:r>
+        <w:rPr>
+          <w:rFonts w:ascii="Consolas" w:hAnsi="Consolas"/>
+          <w:color w:val="666666"/>
+          <w:sz w:val="18"/>
+        </w:rPr>
+        <w:t xml:space="preserve"> 37  </w:t>
+      </w:r>
+      <w:r>
+        <w:rPr>
+          <w:rFonts w:ascii="Consolas" w:hAnsi="Consolas"/>
+          <w:sz w:val="18"/>
+        </w:rPr>
+        <w:t xml:space="preserve">    if: github.ref == 'refs/heads/main' &amp;&amp; github.event_name != 'pull_request'</w:t>
+      </w:r>
+    </w:p>
+    <w:p>
+      <w:pPr>
+        <w:spacing w:after="0" w:line="252" w:lineRule="auto"/>
+      </w:pPr>
+      <w:r>
+        <w:rPr>
+          <w:rFonts w:ascii="Consolas" w:hAnsi="Consolas"/>
+          <w:color w:val="666666"/>
+          <w:sz w:val="18"/>
+        </w:rPr>
+        <w:t xml:space="preserve"> 38  </w:t>
+      </w:r>
+      <w:r>
+        <w:rPr>
+          <w:rFonts w:ascii="Consolas" w:hAnsi="Consolas"/>
+          <w:sz w:val="18"/>
+        </w:rPr>
+        <w:t xml:space="preserve">    runs-on: ubuntu-24.04</w:t>
+      </w:r>
+    </w:p>
+    <w:p>
+      <w:pPr>
+        <w:spacing w:after="0" w:line="252" w:lineRule="auto"/>
+      </w:pPr>
+      <w:r>
+        <w:rPr>
+          <w:rFonts w:ascii="Consolas" w:hAnsi="Consolas"/>
+          <w:color w:val="666666"/>
+          <w:sz w:val="18"/>
+        </w:rPr>
+        <w:t xml:space="preserve"> 39  </w:t>
+      </w:r>
+      <w:r>
+        <w:rPr>
+          <w:rFonts w:ascii="Consolas" w:hAnsi="Consolas"/>
+          <w:sz w:val="18"/>
+        </w:rPr>
+        <w:t xml:space="preserve">    steps:</w:t>
+      </w:r>
+    </w:p>
+    <w:p>
+      <w:pPr>
+        <w:spacing w:after="0" w:line="252" w:lineRule="auto"/>
+      </w:pPr>
+      <w:r>
+        <w:rPr>
+          <w:rFonts w:ascii="Consolas" w:hAnsi="Consolas"/>
+          <w:color w:val="666666"/>
+          <w:sz w:val="18"/>
+        </w:rPr>
+        <w:t xml:space="preserve"> 40  </w:t>
+      </w:r>
+      <w:r>
+        <w:rPr>
+          <w:rFonts w:ascii="Consolas" w:hAnsi="Consolas"/>
+          <w:sz w:val="18"/>
+        </w:rPr>
+        <w:t xml:space="preserve">      - uses: actions/checkout@v7</w:t>
+      </w:r>
+    </w:p>
+    <w:p>
+      <w:pPr>
+        <w:spacing w:after="0" w:line="252" w:lineRule="auto"/>
+      </w:pPr>
+      <w:r>
+        <w:rPr>
+          <w:rFonts w:ascii="Consolas" w:hAnsi="Consolas"/>
+          <w:color w:val="666666"/>
+          <w:sz w:val="18"/>
+        </w:rPr>
+        <w:t xml:space="preserve"> 41  </w:t>
+      </w:r>
+      <w:r>
+        <w:rPr>
+          <w:rFonts w:ascii="Consolas" w:hAnsi="Consolas"/>
+          <w:sz w:val="18"/>
+        </w:rPr>
+        <w:t xml:space="preserve">      - uses: actions/setup-python@v7</w:t>
+      </w:r>
+    </w:p>
+    <w:p>
+      <w:pPr>
+        <w:spacing w:after="0" w:line="252" w:lineRule="auto"/>
+      </w:pPr>
+      <w:r>
+        <w:rPr>
+          <w:rFonts w:ascii="Consolas" w:hAnsi="Consolas"/>
+          <w:color w:val="666666"/>
+          <w:sz w:val="18"/>
+        </w:rPr>
+        <w:t xml:space="preserve"> 42  </w:t>
+      </w:r>
+      <w:r>
+        <w:rPr>
+          <w:rFonts w:ascii="Consolas" w:hAnsi="Consolas"/>
+          <w:sz w:val="18"/>
+        </w:rPr>
+        <w:t xml:space="preserve">        with:</w:t>
+      </w:r>
+    </w:p>
+    <w:p>
+      <w:pPr>
+        <w:spacing w:after="0" w:line="252" w:lineRule="auto"/>
+      </w:pPr>
+      <w:r>
+        <w:rPr>
+          <w:rFonts w:ascii="Consolas" w:hAnsi="Consolas"/>
+          <w:color w:val="666666"/>
+          <w:sz w:val="18"/>
+        </w:rPr>
+        <w:t xml:space="preserve"> 43  </w:t>
+      </w:r>
+      <w:r>
+        <w:rPr>
+          <w:rFonts w:ascii="Consolas" w:hAnsi="Consolas"/>
+          <w:sz w:val="18"/>
+        </w:rPr>
+        <w:t xml:space="preserve">          python-version: '3.11'</w:t>
+      </w:r>
+    </w:p>
+    <w:p>
+      <w:pPr>
+        <w:spacing w:after="0" w:line="252" w:lineRule="auto"/>
+      </w:pPr>
+      <w:r>
+        <w:rPr>
+          <w:rFonts w:ascii="Consolas" w:hAnsi="Consolas"/>
+          <w:color w:val="666666"/>
+          <w:sz w:val="18"/>
+        </w:rPr>
+        <w:t xml:space="preserve"> 44  </w:t>
+      </w:r>
+      <w:r>
+        <w:rPr>
+          <w:rFonts w:ascii="Consolas" w:hAnsi="Consolas"/>
+          <w:sz w:val="18"/>
+        </w:rPr>
+        <w:t xml:space="preserve">          cache: pip</w:t>
+      </w:r>
+    </w:p>
+    <w:p>
+      <w:pPr>
+        <w:spacing w:after="0" w:line="252" w:lineRule="auto"/>
+      </w:pPr>
+      <w:r>
+        <w:rPr>
+          <w:rFonts w:ascii="Consolas" w:hAnsi="Consolas"/>
+          <w:color w:val="666666"/>
+          <w:sz w:val="18"/>
+        </w:rPr>
+        <w:t xml:space="preserve"> 45  </w:t>
+      </w:r>
+      <w:r>
+        <w:rPr>
+          <w:rFonts w:ascii="Consolas" w:hAnsi="Consolas"/>
+          <w:sz w:val="18"/>
+        </w:rPr>
+        <w:t xml:space="preserve">      - name: Install runtime dependencies</w:t>
+      </w:r>
+    </w:p>
+    <w:p>
+      <w:pPr>
+        <w:spacing w:after="0" w:line="252" w:lineRule="auto"/>
+      </w:pPr>
+      <w:r>
+        <w:rPr>
+          <w:rFonts w:ascii="Consolas" w:hAnsi="Consolas"/>
+          <w:color w:val="666666"/>
+          <w:sz w:val="18"/>
+        </w:rPr>
+        <w:t xml:space="preserve"> 46  </w:t>
+      </w:r>
+      <w:r>
+        <w:rPr>
+          <w:rFonts w:ascii="Consolas" w:hAnsi="Consolas"/>
+          <w:sz w:val="18"/>
+        </w:rPr>
+        <w:t xml:space="preserve">        run: python -m pip install -r requirements.txt</w:t>
+      </w:r>
+    </w:p>
+    <w:p>
+      <w:pPr>
+        <w:spacing w:after="0" w:line="252" w:lineRule="auto"/>
+      </w:pPr>
+      <w:r>
+        <w:rPr>
+          <w:rFonts w:ascii="Consolas" w:hAnsi="Consolas"/>
+          <w:color w:val="666666"/>
+          <w:sz w:val="18"/>
+        </w:rPr>
+        <w:t xml:space="preserve"> 47  </w:t>
+      </w:r>
+      <w:r>
+        <w:rPr>
+          <w:rFonts w:ascii="Consolas" w:hAnsi="Consolas"/>
+          <w:sz w:val="18"/>
+        </w:rPr>
+        <w:t xml:space="preserve">      - name: Train and evaluate</w:t>
+      </w:r>
+    </w:p>
+    <w:p>
+      <w:pPr>
+        <w:spacing w:after="0" w:line="252" w:lineRule="auto"/>
+      </w:pPr>
+      <w:r>
+        <w:rPr>
+          <w:rFonts w:ascii="Consolas" w:hAnsi="Consolas"/>
+          <w:color w:val="666666"/>
+          <w:sz w:val="18"/>
+        </w:rPr>
+        <w:t xml:space="preserve"> 48  </w:t>
+      </w:r>
+      <w:r>
+        <w:rPr>
+          <w:rFonts w:ascii="Consolas" w:hAnsi="Consolas"/>
+          <w:sz w:val="18"/>
+        </w:rPr>
+        <w:t xml:space="preserve">        run: python -m src.iris_demo train</w:t>
+      </w:r>
+    </w:p>
+    <w:p>
+      <w:pPr>
+        <w:spacing w:after="0" w:line="252" w:lineRule="auto"/>
+      </w:pPr>
+      <w:r>
+        <w:rPr>
+          <w:rFonts w:ascii="Consolas" w:hAnsi="Consolas"/>
+          <w:color w:val="666666"/>
+          <w:sz w:val="18"/>
+        </w:rPr>
+        <w:t xml:space="preserve"> 49  </w:t>
+      </w:r>
+      <w:r>
+        <w:rPr>
+          <w:rFonts w:ascii="Consolas" w:hAnsi="Consolas"/>
+          <w:sz w:val="18"/>
+        </w:rPr>
+        <w:t xml:space="preserve">      - name: Package tested increment</w:t>
+      </w:r>
+    </w:p>
+    <w:p>
+      <w:pPr>
+        <w:spacing w:after="0" w:line="252" w:lineRule="auto"/>
+      </w:pPr>
+      <w:r>
+        <w:rPr>
+          <w:rFonts w:ascii="Consolas" w:hAnsi="Consolas"/>
+          <w:color w:val="666666"/>
+          <w:sz w:val="18"/>
+        </w:rPr>
+        <w:t xml:space="preserve"> 50  </w:t>
+      </w:r>
+      <w:r>
+        <w:rPr>
+          <w:rFonts w:ascii="Consolas" w:hAnsi="Consolas"/>
+          <w:sz w:val="18"/>
+        </w:rPr>
+        <w:t xml:space="preserve">        run: python tools/package_delivery.py</w:t>
+      </w:r>
+    </w:p>
+    <w:p>
+      <w:pPr>
+        <w:spacing w:after="0" w:line="252" w:lineRule="auto"/>
+      </w:pPr>
+      <w:r>
+        <w:rPr>
+          <w:rFonts w:ascii="Consolas" w:hAnsi="Consolas"/>
+          <w:color w:val="666666"/>
+          <w:sz w:val="18"/>
+        </w:rPr>
+        <w:t xml:space="preserve"> 51  </w:t>
+      </w:r>
+      <w:r>
+        <w:rPr>
+          <w:rFonts w:ascii="Consolas" w:hAnsi="Consolas"/>
+          <w:sz w:val="18"/>
+        </w:rPr>
+        <w:t xml:space="preserve">      - name: Upload delivery</w:t>
+      </w:r>
+    </w:p>
+    <w:p>
+      <w:pPr>
+        <w:spacing w:after="0" w:line="252" w:lineRule="auto"/>
+      </w:pPr>
+      <w:r>
+        <w:rPr>
+          <w:rFonts w:ascii="Consolas" w:hAnsi="Consolas"/>
+          <w:color w:val="666666"/>
+          <w:sz w:val="18"/>
+        </w:rPr>
+        <w:t xml:space="preserve"> 52  </w:t>
+      </w:r>
+      <w:r>
+        <w:rPr>
+          <w:rFonts w:ascii="Consolas" w:hAnsi="Consolas"/>
+          <w:sz w:val="18"/>
+        </w:rPr>
+        <w:t xml:space="preserve">        uses: actions/upload-artifact@v7</w:t>
+      </w:r>
+    </w:p>
+    <w:p>
+      <w:pPr>
+        <w:spacing w:after="0" w:line="252" w:lineRule="auto"/>
+      </w:pPr>
+      <w:r>
+        <w:rPr>
+          <w:rFonts w:ascii="Consolas" w:hAnsi="Consolas"/>
+          <w:color w:val="666666"/>
+          <w:sz w:val="18"/>
+        </w:rPr>
+        <w:t xml:space="preserve"> 53  </w:t>
+      </w:r>
+      <w:r>
+        <w:rPr>
+          <w:rFonts w:ascii="Consolas" w:hAnsi="Consolas"/>
+          <w:sz w:val="18"/>
+        </w:rPr>
+        <w:t xml:space="preserve">        with:</w:t>
+      </w:r>
+    </w:p>
+    <w:p>
+      <w:pPr>
+        <w:spacing w:after="0" w:line="252" w:lineRule="auto"/>
+      </w:pPr>
+      <w:r>
+        <w:rPr>
+          <w:rFonts w:ascii="Consolas" w:hAnsi="Consolas"/>
+          <w:color w:val="666666"/>
+          <w:sz w:val="18"/>
+        </w:rPr>
+        <w:t xml:space="preserve"> 54  </w:t>
+      </w:r>
+      <w:r>
+        <w:rPr>
+          <w:rFonts w:ascii="Consolas" w:hAnsi="Consolas"/>
+          <w:sz w:val="18"/>
+        </w:rPr>
+        <w:t xml:space="preserve">          name: iris-delivery-${{ github.sha }}</w:t>
+      </w:r>
+    </w:p>
+    <w:p>
+      <w:pPr>
+        <w:spacing w:after="0" w:line="252" w:lineRule="auto"/>
+      </w:pPr>
+      <w:r>
+        <w:rPr>
+          <w:rFonts w:ascii="Consolas" w:hAnsi="Consolas"/>
+          <w:color w:val="666666"/>
+          <w:sz w:val="18"/>
+        </w:rPr>
+        <w:t xml:space="preserve"> 55  </w:t>
+      </w:r>
+      <w:r>
+        <w:rPr>
+          <w:rFonts w:ascii="Consolas" w:hAnsi="Consolas"/>
+          <w:sz w:val="18"/>
+        </w:rPr>
+        <w:t xml:space="preserve">          path: dist/iris-delivery.zip</w:t>
+      </w:r>
+    </w:p>
+    <w:p>
+      <w:pPr>
+        <w:spacing w:after="0" w:line="252" w:lineRule="auto"/>
+      </w:pPr>
+      <w:r>
+        <w:rPr>
+          <w:rFonts w:ascii="Consolas" w:hAnsi="Consolas"/>
+          <w:color w:val="666666"/>
+          <w:sz w:val="18"/>
+        </w:rPr>
+        <w:t xml:space="preserve"> 56  </w:t>
+      </w:r>
+      <w:r>
+        <w:rPr>
+          <w:rFonts w:ascii="Consolas" w:hAnsi="Consolas"/>
+          <w:sz w:val="18"/>
+        </w:rPr>
+        <w:t xml:space="preserve">          if-no-files-found: error</w:t>
+      </w:r>
+    </w:p>
+    <w:p>
+      <w:pPr>
+        <w:spacing w:after="0" w:line="252" w:lineRule="auto"/>
+      </w:pPr>
+      <w:r>
+        <w:rPr>
+          <w:rFonts w:ascii="Consolas" w:hAnsi="Consolas"/>
+          <w:color w:val="666666"/>
+          <w:sz w:val="18"/>
+        </w:rPr>
+        <w:t xml:space="preserve"> 57  </w:t>
+      </w:r>
+      <w:r>
+        <w:rPr>
+          <w:rFonts w:ascii="Consolas" w:hAnsi="Consolas"/>
+          <w:sz w:val="18"/>
+        </w:rPr>
+        <w:t xml:space="preserve">          retention-days: 90</w:t>
+      </w:r>
+    </w:p>
+    <w:p/>
+    <w:p>
+      <w:r>
+        <w:t>The needs field gates delivery on successful tests. The condition restricts delivery to main, where training and packaging produce the downloadable accepted increment.</w:t>
+      </w:r>
     </w:p>
     <w:sectPr>
       <w:footerReference w:type="default" r:id="rId16"/>

</xml_diff>